<commit_message>
Added Final Report and Finalized README
</commit_message>
<xml_diff>
--- a/Report_Hesham_Rashid.docx
+++ b/Report_Hesham_Rashid.docx
@@ -75,15 +75,7 @@
           <w:sz w:val="28"/>
           <w:szCs w:val="28"/>
         </w:rPr>
-        <w:t>Ma</w:t>
-      </w:r>
-      <w:r>
-        <w:rPr>
-          <w:rFonts w:ascii="Times New Roman" w:hAnsi="Times New Roman" w:cs="Times New Roman"/>
-          <w:sz w:val="28"/>
-          <w:szCs w:val="28"/>
-        </w:rPr>
-        <w:t>y 1</w:t>
+        <w:t>May 1</w:t>
       </w:r>
       <w:r>
         <w:rPr>
@@ -228,21 +220,7 @@
             <w:rStyle w:val="Hyperlink"/>
             <w:rFonts w:ascii="Times New Roman" w:hAnsi="Times New Roman" w:cs="Times New Roman"/>
           </w:rPr>
-          <w:t>h</w:t>
-        </w:r>
-        <w:r>
-          <w:rPr>
-            <w:rStyle w:val="Hyperlink"/>
-            <w:rFonts w:ascii="Times New Roman" w:hAnsi="Times New Roman" w:cs="Times New Roman"/>
-          </w:rPr>
-          <w:t>e</w:t>
-        </w:r>
-        <w:r>
-          <w:rPr>
-            <w:rStyle w:val="Hyperlink"/>
-            <w:rFonts w:ascii="Times New Roman" w:hAnsi="Times New Roman" w:cs="Times New Roman"/>
-          </w:rPr>
-          <w:t>re</w:t>
+          <w:t>here</w:t>
         </w:r>
       </w:hyperlink>
       <w:r>
@@ -359,21 +337,7 @@
             <w:rStyle w:val="Hyperlink"/>
             <w:rFonts w:ascii="Times New Roman" w:hAnsi="Times New Roman" w:cs="Times New Roman"/>
           </w:rPr>
-          <w:t>h</w:t>
-        </w:r>
-        <w:r>
-          <w:rPr>
-            <w:rStyle w:val="Hyperlink"/>
-            <w:rFonts w:ascii="Times New Roman" w:hAnsi="Times New Roman" w:cs="Times New Roman"/>
-          </w:rPr>
-          <w:t>e</w:t>
-        </w:r>
-        <w:r>
-          <w:rPr>
-            <w:rStyle w:val="Hyperlink"/>
-            <w:rFonts w:ascii="Times New Roman" w:hAnsi="Times New Roman" w:cs="Times New Roman"/>
-          </w:rPr>
-          <w:t>re</w:t>
+          <w:t>here</w:t>
         </w:r>
       </w:hyperlink>
       <w:r>
@@ -419,6 +383,7 @@
     </w:p>
     <w:p>
       <w:pPr>
+        <w:spacing w:line="480" w:lineRule="auto"/>
         <w:rPr>
           <w:rFonts w:ascii="Times New Roman" w:hAnsi="Times New Roman" w:cs="Times New Roman"/>
         </w:rPr>
@@ -501,21 +466,7 @@
         <w:rPr>
           <w:rFonts w:ascii="Times New Roman" w:hAnsi="Times New Roman" w:cs="Times New Roman"/>
         </w:rPr>
-        <w:t xml:space="preserve">This connects with this project as I used a fact table in a star schema. As shown later in the report there are 7 dimension tables surrounding the </w:t>
-      </w:r>
-      <w:proofErr w:type="spellStart"/>
-      <w:r>
-        <w:rPr>
-          <w:rFonts w:ascii="Times New Roman" w:hAnsi="Times New Roman" w:cs="Times New Roman"/>
-        </w:rPr>
-        <w:t>fact_sales</w:t>
-      </w:r>
-      <w:proofErr w:type="spellEnd"/>
-      <w:r>
-        <w:rPr>
-          <w:rFonts w:ascii="Times New Roman" w:hAnsi="Times New Roman" w:cs="Times New Roman"/>
-        </w:rPr>
-        <w:t xml:space="preserve"> table that sits in the center.</w:t>
+        <w:t>This connects with this project as I used a fact table in a star schema. As shown later in the report there are 7 dimension tables surrounding the fact_sales table that sits in the center.</w:t>
       </w:r>
     </w:p>
     <w:p>
@@ -797,6 +748,7 @@
     </w:p>
     <w:p>
       <w:pPr>
+        <w:spacing w:line="480" w:lineRule="auto"/>
         <w:rPr>
           <w:rFonts w:ascii="Times New Roman" w:hAnsi="Times New Roman" w:cs="Times New Roman"/>
         </w:rPr>
@@ -946,15 +898,7 @@
           <w:b/>
           <w:bCs/>
         </w:rPr>
-        <w:t>Data limitations and quality observations</w:t>
-      </w:r>
-      <w:r>
-        <w:rPr>
-          <w:rFonts w:ascii="Times New Roman" w:hAnsi="Times New Roman" w:cs="Times New Roman"/>
-          <w:b/>
-          <w:bCs/>
-        </w:rPr>
-        <w:t>:</w:t>
+        <w:t>Data limitations and quality observations:</w:t>
       </w:r>
     </w:p>
     <w:p>
@@ -969,19 +913,11 @@
           <w:rFonts w:ascii="Times New Roman" w:hAnsi="Times New Roman" w:cs="Times New Roman"/>
         </w:rPr>
       </w:pPr>
-      <w:proofErr w:type="spellStart"/>
-      <w:r>
-        <w:rPr>
-          <w:rFonts w:ascii="Times New Roman" w:hAnsi="Times New Roman" w:cs="Times New Roman"/>
-        </w:rPr>
-        <w:t>critic_score</w:t>
-      </w:r>
-      <w:proofErr w:type="spellEnd"/>
-      <w:r>
-        <w:rPr>
-          <w:rFonts w:ascii="Times New Roman" w:hAnsi="Times New Roman" w:cs="Times New Roman"/>
-        </w:rPr>
-        <w:t xml:space="preserve"> had 57,338 null values out of 64,016 rows</w:t>
+      <w:r>
+        <w:rPr>
+          <w:rFonts w:ascii="Times New Roman" w:hAnsi="Times New Roman" w:cs="Times New Roman"/>
+        </w:rPr>
+        <w:t>critic_score had 57,338 null values out of 64,016 rows</w:t>
       </w:r>
       <w:r>
         <w:rPr>
@@ -1008,19 +944,11 @@
           <w:rFonts w:ascii="Times New Roman" w:hAnsi="Times New Roman" w:cs="Times New Roman"/>
         </w:rPr>
       </w:pPr>
-      <w:proofErr w:type="spellStart"/>
-      <w:r>
-        <w:rPr>
-          <w:rFonts w:ascii="Times New Roman" w:hAnsi="Times New Roman" w:cs="Times New Roman"/>
-        </w:rPr>
-        <w:t>total_sales</w:t>
-      </w:r>
-      <w:proofErr w:type="spellEnd"/>
-      <w:r>
-        <w:rPr>
-          <w:rFonts w:ascii="Times New Roman" w:hAnsi="Times New Roman" w:cs="Times New Roman"/>
-        </w:rPr>
-        <w:t xml:space="preserve"> had 45,094 nulls</w:t>
+      <w:r>
+        <w:rPr>
+          <w:rFonts w:ascii="Times New Roman" w:hAnsi="Times New Roman" w:cs="Times New Roman"/>
+        </w:rPr>
+        <w:t>total_sales had 45,094 nulls</w:t>
       </w:r>
       <w:r>
         <w:rPr>
@@ -1047,19 +975,11 @@
           <w:rFonts w:ascii="Times New Roman" w:hAnsi="Times New Roman" w:cs="Times New Roman"/>
         </w:rPr>
       </w:pPr>
-      <w:proofErr w:type="spellStart"/>
-      <w:r>
-        <w:rPr>
-          <w:rFonts w:ascii="Times New Roman" w:hAnsi="Times New Roman" w:cs="Times New Roman"/>
-        </w:rPr>
-        <w:t>release_date</w:t>
-      </w:r>
-      <w:proofErr w:type="spellEnd"/>
-      <w:r>
-        <w:rPr>
-          <w:rFonts w:ascii="Times New Roman" w:hAnsi="Times New Roman" w:cs="Times New Roman"/>
-        </w:rPr>
-        <w:t xml:space="preserve"> had 7,051 nulls </w:t>
+      <w:r>
+        <w:rPr>
+          <w:rFonts w:ascii="Times New Roman" w:hAnsi="Times New Roman" w:cs="Times New Roman"/>
+        </w:rPr>
+        <w:t xml:space="preserve">release_date had 7,051 nulls </w:t>
       </w:r>
     </w:p>
     <w:p>
@@ -1134,6 +1054,7 @@
     </w:p>
     <w:p>
       <w:pPr>
+        <w:spacing w:line="480" w:lineRule="auto"/>
         <w:rPr>
           <w:rFonts w:ascii="Times New Roman" w:hAnsi="Times New Roman" w:cs="Times New Roman"/>
         </w:rPr>
@@ -1176,50 +1097,3308 @@
         <w:rPr>
           <w:rFonts w:ascii="Times New Roman" w:hAnsi="Times New Roman" w:cs="Times New Roman"/>
         </w:rPr>
-        <w:t>The data is stored in a Postgres Database (</w:t>
-      </w:r>
-      <w:proofErr w:type="spellStart"/>
-      <w:r>
-        <w:rPr>
-          <w:rFonts w:ascii="Times New Roman" w:hAnsi="Times New Roman" w:cs="Times New Roman"/>
-        </w:rPr>
-        <w:t>retro_games_db</w:t>
-      </w:r>
-      <w:proofErr w:type="spellEnd"/>
-      <w:r>
-        <w:rPr>
-          <w:rFonts w:ascii="Times New Roman" w:hAnsi="Times New Roman" w:cs="Times New Roman"/>
-        </w:rPr>
-        <w:t>). There are two schemas in the database. The first schema is a raw staging area (</w:t>
-      </w:r>
-      <w:proofErr w:type="spellStart"/>
-      <w:r>
-        <w:rPr>
-          <w:rFonts w:ascii="Times New Roman" w:hAnsi="Times New Roman" w:cs="Times New Roman"/>
-        </w:rPr>
-        <w:t>src</w:t>
-      </w:r>
-      <w:proofErr w:type="spellEnd"/>
-      <w:r>
-        <w:rPr>
-          <w:rFonts w:ascii="Times New Roman" w:hAnsi="Times New Roman" w:cs="Times New Roman"/>
-        </w:rPr>
-        <w:t xml:space="preserve"> schema) this is where the data gets extracted from the CSV files to the Postgres Database. Then the data gets transformed to fit the second schema, which is the </w:t>
-      </w:r>
-      <w:proofErr w:type="spellStart"/>
-      <w:r>
-        <w:rPr>
-          <w:rFonts w:ascii="Times New Roman" w:hAnsi="Times New Roman" w:cs="Times New Roman"/>
-        </w:rPr>
-        <w:t>dw</w:t>
-      </w:r>
-      <w:proofErr w:type="spellEnd"/>
-      <w:r>
-        <w:rPr>
-          <w:rFonts w:ascii="Times New Roman" w:hAnsi="Times New Roman" w:cs="Times New Roman"/>
-        </w:rPr>
-        <w:t xml:space="preserve">, data warehouse, schema that has a central fact table and 7 dimension tables surrounding it. </w:t>
-      </w:r>
+        <w:t xml:space="preserve">The data is stored in a Postgres Database (retro_games_db). There are two schemas in the database. The first schema is a raw staging area (src schema) this is where the data gets extracted from the CSV files to the Postgres Database. Then the data gets transformed to fit the second schema, which is the dw, data warehouse, schema that has a central fact table and 7 dimension tables surrounding it. </w:t>
+      </w:r>
+      <w:r>
+        <w:rPr>
+          <w:rFonts w:ascii="Times New Roman" w:hAnsi="Times New Roman" w:cs="Times New Roman"/>
+        </w:rPr>
+        <w:t xml:space="preserve">There is an ETL script that is written in python that handles the extraction of the data from the CSV file to the src schema, then transform the data in the src schema to fit the dw schema, then load the data into the dw schema for us to do queries on. </w:t>
+      </w:r>
+    </w:p>
+    <w:p>
+      <w:pPr>
+        <w:spacing w:line="480" w:lineRule="auto"/>
+        <w:rPr>
+          <w:rFonts w:ascii="Times New Roman" w:hAnsi="Times New Roman" w:cs="Times New Roman"/>
+        </w:rPr>
+      </w:pPr>
+      <w:r>
+        <w:rPr>
+          <w:rFonts w:ascii="Times New Roman" w:hAnsi="Times New Roman" w:cs="Times New Roman"/>
+        </w:rPr>
+        <w:t>This is the ERD to visualize the schemas and how the fact table connects with the dimension tables:</w:t>
+      </w:r>
+    </w:p>
+    <w:p>
+      <w:pPr>
+        <w:spacing w:line="480" w:lineRule="auto"/>
+        <w:rPr>
+          <w:rFonts w:ascii="Times New Roman" w:hAnsi="Times New Roman" w:cs="Times New Roman"/>
+        </w:rPr>
+      </w:pPr>
+      <w:r>
+        <w:rPr>
+          <w:rFonts w:ascii="Times New Roman" w:hAnsi="Times New Roman" w:cs="Times New Roman"/>
+          <w:noProof/>
+        </w:rPr>
+        <w:drawing>
+          <wp:inline distT="0" distB="0" distL="0" distR="0" wp14:anchorId="760428BA" wp14:editId="7E997736">
+            <wp:extent cx="3897537" cy="4324350"/>
+            <wp:effectExtent l="0" t="0" r="8255" b="0"/>
+            <wp:docPr id="1206310176" name="Picture 1"/>
+            <wp:cNvGraphicFramePr>
+              <a:graphicFrameLocks xmlns:a="http://schemas.openxmlformats.org/drawingml/2006/main" noChangeAspect="1"/>
+            </wp:cNvGraphicFramePr>
+            <a:graphic xmlns:a="http://schemas.openxmlformats.org/drawingml/2006/main">
+              <a:graphicData uri="http://schemas.openxmlformats.org/drawingml/2006/picture">
+                <pic:pic xmlns:pic="http://schemas.openxmlformats.org/drawingml/2006/picture">
+                  <pic:nvPicPr>
+                    <pic:cNvPr id="1206310176" name="Picture 1206310176"/>
+                    <pic:cNvPicPr/>
+                  </pic:nvPicPr>
+                  <pic:blipFill>
+                    <a:blip r:embed="rId8" cstate="print">
+                      <a:extLst>
+                        <a:ext uri="{28A0092B-C50C-407E-A947-70E740481C1C}">
+                          <a14:useLocalDpi xmlns:a14="http://schemas.microsoft.com/office/drawing/2010/main" val="0"/>
+                        </a:ext>
+                      </a:extLst>
+                    </a:blip>
+                    <a:stretch>
+                      <a:fillRect/>
+                    </a:stretch>
+                  </pic:blipFill>
+                  <pic:spPr>
+                    <a:xfrm>
+                      <a:off x="0" y="0"/>
+                      <a:ext cx="3901917" cy="4329209"/>
+                    </a:xfrm>
+                    <a:prstGeom prst="rect">
+                      <a:avLst/>
+                    </a:prstGeom>
+                  </pic:spPr>
+                </pic:pic>
+              </a:graphicData>
+            </a:graphic>
+          </wp:inline>
+        </w:drawing>
+      </w:r>
+    </w:p>
+    <w:p>
+      <w:pPr>
+        <w:spacing w:line="480" w:lineRule="auto"/>
+        <w:rPr>
+          <w:rFonts w:ascii="Times New Roman" w:hAnsi="Times New Roman" w:cs="Times New Roman"/>
+        </w:rPr>
+      </w:pPr>
+      <w:r>
+        <w:rPr>
+          <w:rFonts w:ascii="Times New Roman" w:hAnsi="Times New Roman" w:cs="Times New Roman"/>
+          <w:b/>
+          <w:bCs/>
+        </w:rPr>
+        <w:lastRenderedPageBreak/>
+        <w:t>Dimension Table Descriptions</w:t>
+      </w:r>
+      <w:r>
+        <w:rPr>
+          <w:rFonts w:ascii="Times New Roman" w:hAnsi="Times New Roman" w:cs="Times New Roman"/>
+        </w:rPr>
+        <w:t xml:space="preserve"> </w:t>
+      </w:r>
+      <w:r>
+        <w:rPr>
+          <w:rFonts w:ascii="Times New Roman" w:hAnsi="Times New Roman" w:cs="Times New Roman"/>
+        </w:rPr>
+        <w:t>Here is a brief description of each dimension table</w:t>
+      </w:r>
+      <w:r>
+        <w:rPr>
+          <w:rFonts w:ascii="Times New Roman" w:hAnsi="Times New Roman" w:cs="Times New Roman"/>
+        </w:rPr>
+        <w:t>:</w:t>
+      </w:r>
+    </w:p>
+    <w:p>
+      <w:pPr>
+        <w:pStyle w:val="ListParagraph"/>
+        <w:numPr>
+          <w:ilvl w:val="0"/>
+          <w:numId w:val="4"/>
+        </w:numPr>
+        <w:spacing w:line="480" w:lineRule="auto"/>
+        <w:rPr>
+          <w:rFonts w:ascii="Times New Roman" w:hAnsi="Times New Roman" w:cs="Times New Roman"/>
+        </w:rPr>
+      </w:pPr>
+      <w:r>
+        <w:rPr>
+          <w:rFonts w:ascii="Times New Roman" w:hAnsi="Times New Roman" w:cs="Times New Roman"/>
+          <w:b/>
+          <w:bCs/>
+        </w:rPr>
+        <w:t>dim_game</w:t>
+      </w:r>
+      <w:r>
+        <w:rPr>
+          <w:rFonts w:ascii="Times New Roman" w:hAnsi="Times New Roman" w:cs="Times New Roman"/>
+        </w:rPr>
+        <w:t xml:space="preserve"> This dimension stores each game title along with a derived score_tier column that buckets the raw critic score into four categories: Acclaimed (8+), Good (7-8), Mixed (5-7), and Poor (&lt;5). This dimension implements SCD Type 2 to track changes in game records over time. The source dataset included a last_update column indicating when a record was revised, which was used as the expiry_date. This allows historical analysis of how sales figures were revised after initial reporting.</w:t>
+      </w:r>
+    </w:p>
+    <w:p>
+      <w:pPr>
+        <w:pStyle w:val="ListParagraph"/>
+        <w:numPr>
+          <w:ilvl w:val="0"/>
+          <w:numId w:val="4"/>
+        </w:numPr>
+        <w:spacing w:line="480" w:lineRule="auto"/>
+        <w:rPr>
+          <w:rFonts w:ascii="Times New Roman" w:hAnsi="Times New Roman" w:cs="Times New Roman"/>
+        </w:rPr>
+      </w:pPr>
+      <w:r>
+        <w:rPr>
+          <w:rFonts w:ascii="Times New Roman" w:hAnsi="Times New Roman" w:cs="Times New Roman"/>
+          <w:b/>
+          <w:bCs/>
+        </w:rPr>
+        <w:t>dim_platform</w:t>
+      </w:r>
+      <w:r>
+        <w:rPr>
+          <w:rFonts w:ascii="Times New Roman" w:hAnsi="Times New Roman" w:cs="Times New Roman"/>
+        </w:rPr>
+        <w:t xml:space="preserve"> The source data stored platform information as abbreviated codes such as GC, PS2, and X360 which are not meaningful on their own. This dimension enriches those abbreviations with full platform names, manufacturer</w:t>
+      </w:r>
+      <w:r>
+        <w:rPr>
+          <w:rFonts w:ascii="Times New Roman" w:hAnsi="Times New Roman" w:cs="Times New Roman"/>
+        </w:rPr>
+        <w:t xml:space="preserve">, </w:t>
+      </w:r>
+      <w:r>
+        <w:rPr>
+          <w:rFonts w:ascii="Times New Roman" w:hAnsi="Times New Roman" w:cs="Times New Roman"/>
+        </w:rPr>
+        <w:t>platform type and console generation</w:t>
+      </w:r>
+      <w:r>
+        <w:rPr>
+          <w:rFonts w:ascii="Times New Roman" w:hAnsi="Times New Roman" w:cs="Times New Roman"/>
+        </w:rPr>
+        <w:t>. This was</w:t>
+      </w:r>
+      <w:r>
+        <w:rPr>
+          <w:rFonts w:ascii="Times New Roman" w:hAnsi="Times New Roman" w:cs="Times New Roman"/>
+        </w:rPr>
+        <w:t xml:space="preserve"> added manually through a lookup table in the ETL pipeline.</w:t>
+      </w:r>
+    </w:p>
+    <w:p>
+      <w:pPr>
+        <w:pStyle w:val="ListParagraph"/>
+        <w:numPr>
+          <w:ilvl w:val="0"/>
+          <w:numId w:val="4"/>
+        </w:numPr>
+        <w:spacing w:line="480" w:lineRule="auto"/>
+        <w:rPr>
+          <w:rFonts w:ascii="Times New Roman" w:hAnsi="Times New Roman" w:cs="Times New Roman"/>
+        </w:rPr>
+      </w:pPr>
+      <w:r>
+        <w:rPr>
+          <w:rFonts w:ascii="Times New Roman" w:hAnsi="Times New Roman" w:cs="Times New Roman"/>
+          <w:b/>
+          <w:bCs/>
+        </w:rPr>
+        <w:t>dim_date</w:t>
+      </w:r>
+      <w:r>
+        <w:rPr>
+          <w:rFonts w:ascii="Times New Roman" w:hAnsi="Times New Roman" w:cs="Times New Roman"/>
+        </w:rPr>
+        <w:t xml:space="preserve"> Dates were parsed from the raw release_date column and broken into year, month, quarter, and decade. A derived gaming_era column was added to group years into historically meaningful console generations</w:t>
+      </w:r>
+      <w:r>
+        <w:rPr>
+          <w:rFonts w:ascii="Times New Roman" w:hAnsi="Times New Roman" w:cs="Times New Roman"/>
+        </w:rPr>
+        <w:t xml:space="preserve">. </w:t>
+      </w:r>
+      <w:r>
+        <w:rPr>
+          <w:rFonts w:ascii="Times New Roman" w:hAnsi="Times New Roman" w:cs="Times New Roman"/>
+        </w:rPr>
+        <w:t>An Unknown surrogate record was inserted as the first row to handle the 7,051 games with missing release dates, allowing those records to still participate in the fact table without being dropped.</w:t>
+      </w:r>
+    </w:p>
+    <w:p>
+      <w:pPr>
+        <w:pStyle w:val="ListParagraph"/>
+        <w:numPr>
+          <w:ilvl w:val="0"/>
+          <w:numId w:val="4"/>
+        </w:numPr>
+        <w:spacing w:line="480" w:lineRule="auto"/>
+        <w:rPr>
+          <w:rFonts w:ascii="Times New Roman" w:hAnsi="Times New Roman" w:cs="Times New Roman"/>
+        </w:rPr>
+      </w:pPr>
+      <w:r>
+        <w:rPr>
+          <w:rFonts w:ascii="Times New Roman" w:hAnsi="Times New Roman" w:cs="Times New Roman"/>
+          <w:b/>
+          <w:bCs/>
+        </w:rPr>
+        <w:t>dim_genre</w:t>
+      </w:r>
+      <w:r>
+        <w:rPr>
+          <w:rFonts w:ascii="Times New Roman" w:hAnsi="Times New Roman" w:cs="Times New Roman"/>
+        </w:rPr>
+        <w:t xml:space="preserve"> Genre values in the source data formed a fixed controlled vocabulary of 20 genres. Because both the genre names and their category mappings are fully known and static, this dimension was seeded directly in the DDL rather than loaded dynamically from the CSV.</w:t>
+      </w:r>
+    </w:p>
+    <w:p>
+      <w:pPr>
+        <w:pStyle w:val="ListParagraph"/>
+        <w:numPr>
+          <w:ilvl w:val="0"/>
+          <w:numId w:val="4"/>
+        </w:numPr>
+        <w:spacing w:line="480" w:lineRule="auto"/>
+        <w:rPr>
+          <w:rFonts w:ascii="Times New Roman" w:hAnsi="Times New Roman" w:cs="Times New Roman"/>
+        </w:rPr>
+      </w:pPr>
+      <w:r>
+        <w:rPr>
+          <w:rFonts w:ascii="Times New Roman" w:hAnsi="Times New Roman" w:cs="Times New Roman"/>
+          <w:b/>
+          <w:bCs/>
+        </w:rPr>
+        <w:t>dim_region</w:t>
+      </w:r>
+      <w:r>
+        <w:rPr>
+          <w:rFonts w:ascii="Times New Roman" w:hAnsi="Times New Roman" w:cs="Times New Roman"/>
+        </w:rPr>
+        <w:t xml:space="preserve"> Regional sales in the source data were stored as separate columns</w:t>
+      </w:r>
+      <w:r>
+        <w:rPr>
+          <w:rFonts w:ascii="Times New Roman" w:hAnsi="Times New Roman" w:cs="Times New Roman"/>
+        </w:rPr>
+        <w:t xml:space="preserve">, </w:t>
+      </w:r>
+      <w:r>
+        <w:rPr>
+          <w:rFonts w:ascii="Times New Roman" w:hAnsi="Times New Roman" w:cs="Times New Roman"/>
+        </w:rPr>
+        <w:t>na_sales, jp_sales, pal_sales, and other_sales</w:t>
+      </w:r>
+      <w:r>
+        <w:rPr>
+          <w:rFonts w:ascii="Times New Roman" w:hAnsi="Times New Roman" w:cs="Times New Roman"/>
+        </w:rPr>
+        <w:t xml:space="preserve">, </w:t>
+      </w:r>
+      <w:r>
+        <w:rPr>
+          <w:rFonts w:ascii="Times New Roman" w:hAnsi="Times New Roman" w:cs="Times New Roman"/>
+        </w:rPr>
+        <w:t>rather than as rows. This dimension normalizes those columns into four region records</w:t>
+      </w:r>
+      <w:r>
+        <w:rPr>
+          <w:rFonts w:ascii="Times New Roman" w:hAnsi="Times New Roman" w:cs="Times New Roman"/>
+        </w:rPr>
+        <w:t>.</w:t>
+      </w:r>
+    </w:p>
+    <w:p>
+      <w:pPr>
+        <w:pStyle w:val="ListParagraph"/>
+        <w:numPr>
+          <w:ilvl w:val="0"/>
+          <w:numId w:val="4"/>
+        </w:numPr>
+        <w:spacing w:line="480" w:lineRule="auto"/>
+        <w:rPr>
+          <w:rFonts w:ascii="Times New Roman" w:hAnsi="Times New Roman" w:cs="Times New Roman"/>
+        </w:rPr>
+      </w:pPr>
+      <w:r>
+        <w:rPr>
+          <w:rFonts w:ascii="Times New Roman" w:hAnsi="Times New Roman" w:cs="Times New Roman"/>
+          <w:b/>
+          <w:bCs/>
+        </w:rPr>
+        <w:lastRenderedPageBreak/>
+        <w:t>dim_publisher / dim_developer</w:t>
+      </w:r>
+      <w:r>
+        <w:rPr>
+          <w:rFonts w:ascii="Times New Roman" w:hAnsi="Times New Roman" w:cs="Times New Roman"/>
+        </w:rPr>
+        <w:t xml:space="preserve"> These are simple lookup dimensions loaded dynamically from the unique publisher and developer values in the source CSV. Both include an Unknown fallback record to handle the 17 null developer values and any publisher records labeled Unknown in the source data.</w:t>
+      </w:r>
+    </w:p>
+    <w:p>
+      <w:pPr>
+        <w:spacing w:line="480" w:lineRule="auto"/>
+        <w:rPr>
+          <w:rFonts w:ascii="Times New Roman" w:hAnsi="Times New Roman" w:cs="Times New Roman"/>
+        </w:rPr>
+      </w:pPr>
+      <w:r>
+        <w:rPr>
+          <w:rFonts w:ascii="Times New Roman" w:hAnsi="Times New Roman" w:cs="Times New Roman"/>
+          <w:b/>
+          <w:bCs/>
+        </w:rPr>
+        <w:t xml:space="preserve">Fact Table Decription: </w:t>
+      </w:r>
+      <w:r>
+        <w:rPr>
+          <w:rFonts w:ascii="Times New Roman" w:hAnsi="Times New Roman" w:cs="Times New Roman"/>
+        </w:rPr>
+        <w:t xml:space="preserve">Each grain (row) of the fact table represents one row per game, platform, and region. </w:t>
+      </w:r>
+    </w:p>
+    <w:p>
+      <w:pPr>
+        <w:spacing w:line="480" w:lineRule="auto"/>
+        <w:rPr>
+          <w:rFonts w:ascii="Times New Roman" w:hAnsi="Times New Roman" w:cs="Times New Roman"/>
+        </w:rPr>
+      </w:pPr>
+      <w:r>
+        <w:rPr>
+          <w:rFonts w:ascii="Times New Roman" w:hAnsi="Times New Roman" w:cs="Times New Roman"/>
+          <w:b/>
+          <w:bCs/>
+        </w:rPr>
+        <w:t>OLTP Companion Design:</w:t>
+      </w:r>
+      <w:r>
+        <w:rPr>
+          <w:rFonts w:ascii="Times New Roman" w:hAnsi="Times New Roman" w:cs="Times New Roman"/>
+        </w:rPr>
+        <w:t xml:space="preserve"> For the OLTP, the tables could look something like:</w:t>
+      </w:r>
+    </w:p>
+    <w:p>
+      <w:pPr>
+        <w:spacing w:line="480" w:lineRule="auto"/>
+        <w:rPr>
+          <w:rFonts w:ascii="Times New Roman" w:hAnsi="Times New Roman" w:cs="Times New Roman"/>
+        </w:rPr>
+      </w:pPr>
+      <w:r>
+        <w:rPr>
+          <w:rFonts w:ascii="Times New Roman" w:hAnsi="Times New Roman" w:cs="Times New Roman"/>
+          <w:b/>
+          <w:bCs/>
+        </w:rPr>
+        <w:t>OLTP Tables:</w:t>
+      </w:r>
+    </w:p>
+    <w:p>
+      <w:pPr>
+        <w:numPr>
+          <w:ilvl w:val="0"/>
+          <w:numId w:val="5"/>
+        </w:numPr>
+        <w:spacing w:line="480" w:lineRule="auto"/>
+        <w:rPr>
+          <w:rFonts w:ascii="Times New Roman" w:hAnsi="Times New Roman" w:cs="Times New Roman"/>
+        </w:rPr>
+      </w:pPr>
+      <w:r>
+        <w:rPr>
+          <w:rFonts w:ascii="Times New Roman" w:hAnsi="Times New Roman" w:cs="Times New Roman"/>
+        </w:rPr>
+        <w:t>games</w:t>
+      </w:r>
+      <w:r>
+        <w:rPr>
+          <w:rFonts w:ascii="Times New Roman" w:hAnsi="Times New Roman" w:cs="Times New Roman"/>
+        </w:rPr>
+        <w:t>:</w:t>
+      </w:r>
+      <w:r>
+        <w:rPr>
+          <w:rFonts w:ascii="Times New Roman" w:hAnsi="Times New Roman" w:cs="Times New Roman"/>
+        </w:rPr>
+        <w:t xml:space="preserve"> game_id, title, genre_id, developer_id, release_date</w:t>
+      </w:r>
+    </w:p>
+    <w:p>
+      <w:pPr>
+        <w:numPr>
+          <w:ilvl w:val="0"/>
+          <w:numId w:val="5"/>
+        </w:numPr>
+        <w:spacing w:line="480" w:lineRule="auto"/>
+        <w:rPr>
+          <w:rFonts w:ascii="Times New Roman" w:hAnsi="Times New Roman" w:cs="Times New Roman"/>
+        </w:rPr>
+      </w:pPr>
+      <w:r>
+        <w:rPr>
+          <w:rFonts w:ascii="Times New Roman" w:hAnsi="Times New Roman" w:cs="Times New Roman"/>
+        </w:rPr>
+        <w:t>platforms</w:t>
+      </w:r>
+      <w:r>
+        <w:rPr>
+          <w:rFonts w:ascii="Times New Roman" w:hAnsi="Times New Roman" w:cs="Times New Roman"/>
+        </w:rPr>
+        <w:t>:</w:t>
+      </w:r>
+      <w:r>
+        <w:rPr>
+          <w:rFonts w:ascii="Times New Roman" w:hAnsi="Times New Roman" w:cs="Times New Roman"/>
+        </w:rPr>
+        <w:t xml:space="preserve"> platform_id, platform_name, manufacturer_id</w:t>
+      </w:r>
+    </w:p>
+    <w:p>
+      <w:pPr>
+        <w:numPr>
+          <w:ilvl w:val="0"/>
+          <w:numId w:val="5"/>
+        </w:numPr>
+        <w:spacing w:line="480" w:lineRule="auto"/>
+        <w:rPr>
+          <w:rFonts w:ascii="Times New Roman" w:hAnsi="Times New Roman" w:cs="Times New Roman"/>
+        </w:rPr>
+      </w:pPr>
+      <w:r>
+        <w:rPr>
+          <w:rFonts w:ascii="Times New Roman" w:hAnsi="Times New Roman" w:cs="Times New Roman"/>
+        </w:rPr>
+        <w:t>manufacturers</w:t>
+      </w:r>
+      <w:r>
+        <w:rPr>
+          <w:rFonts w:ascii="Times New Roman" w:hAnsi="Times New Roman" w:cs="Times New Roman"/>
+        </w:rPr>
+        <w:t>:</w:t>
+      </w:r>
+      <w:r>
+        <w:rPr>
+          <w:rFonts w:ascii="Times New Roman" w:hAnsi="Times New Roman" w:cs="Times New Roman"/>
+        </w:rPr>
+        <w:t xml:space="preserve"> manufacturer_id, manufacturer_name, country</w:t>
+      </w:r>
+    </w:p>
+    <w:p>
+      <w:pPr>
+        <w:numPr>
+          <w:ilvl w:val="0"/>
+          <w:numId w:val="5"/>
+        </w:numPr>
+        <w:spacing w:line="480" w:lineRule="auto"/>
+        <w:rPr>
+          <w:rFonts w:ascii="Times New Roman" w:hAnsi="Times New Roman" w:cs="Times New Roman"/>
+        </w:rPr>
+      </w:pPr>
+      <w:r>
+        <w:rPr>
+          <w:rFonts w:ascii="Times New Roman" w:hAnsi="Times New Roman" w:cs="Times New Roman"/>
+        </w:rPr>
+        <w:t>publishers</w:t>
+      </w:r>
+      <w:r>
+        <w:rPr>
+          <w:rFonts w:ascii="Times New Roman" w:hAnsi="Times New Roman" w:cs="Times New Roman"/>
+        </w:rPr>
+        <w:t>:</w:t>
+      </w:r>
+      <w:r>
+        <w:rPr>
+          <w:rFonts w:ascii="Times New Roman" w:hAnsi="Times New Roman" w:cs="Times New Roman"/>
+        </w:rPr>
+        <w:t xml:space="preserve"> publisher_id, publisher_name</w:t>
+      </w:r>
+    </w:p>
+    <w:p>
+      <w:pPr>
+        <w:numPr>
+          <w:ilvl w:val="0"/>
+          <w:numId w:val="5"/>
+        </w:numPr>
+        <w:spacing w:line="480" w:lineRule="auto"/>
+        <w:rPr>
+          <w:rFonts w:ascii="Times New Roman" w:hAnsi="Times New Roman" w:cs="Times New Roman"/>
+        </w:rPr>
+      </w:pPr>
+      <w:r>
+        <w:rPr>
+          <w:rFonts w:ascii="Times New Roman" w:hAnsi="Times New Roman" w:cs="Times New Roman"/>
+        </w:rPr>
+        <w:t>developers</w:t>
+      </w:r>
+      <w:r>
+        <w:rPr>
+          <w:rFonts w:ascii="Times New Roman" w:hAnsi="Times New Roman" w:cs="Times New Roman"/>
+        </w:rPr>
+        <w:t>:</w:t>
+      </w:r>
+      <w:r>
+        <w:rPr>
+          <w:rFonts w:ascii="Times New Roman" w:hAnsi="Times New Roman" w:cs="Times New Roman"/>
+        </w:rPr>
+        <w:t xml:space="preserve"> developer_id, developer_name</w:t>
+      </w:r>
+    </w:p>
+    <w:p>
+      <w:pPr>
+        <w:numPr>
+          <w:ilvl w:val="0"/>
+          <w:numId w:val="5"/>
+        </w:numPr>
+        <w:spacing w:line="480" w:lineRule="auto"/>
+        <w:rPr>
+          <w:rFonts w:ascii="Times New Roman" w:hAnsi="Times New Roman" w:cs="Times New Roman"/>
+        </w:rPr>
+      </w:pPr>
+      <w:r>
+        <w:rPr>
+          <w:rFonts w:ascii="Times New Roman" w:hAnsi="Times New Roman" w:cs="Times New Roman"/>
+        </w:rPr>
+        <w:t>reviews</w:t>
+      </w:r>
+      <w:r>
+        <w:rPr>
+          <w:rFonts w:ascii="Times New Roman" w:hAnsi="Times New Roman" w:cs="Times New Roman"/>
+        </w:rPr>
+        <w:t xml:space="preserve">: </w:t>
+      </w:r>
+      <w:r>
+        <w:rPr>
+          <w:rFonts w:ascii="Times New Roman" w:hAnsi="Times New Roman" w:cs="Times New Roman"/>
+        </w:rPr>
+        <w:t>review_id, game_id, platform_id, critic_score, review_date, source</w:t>
+      </w:r>
+    </w:p>
+    <w:p>
+      <w:pPr>
+        <w:numPr>
+          <w:ilvl w:val="0"/>
+          <w:numId w:val="5"/>
+        </w:numPr>
+        <w:spacing w:line="480" w:lineRule="auto"/>
+        <w:rPr>
+          <w:rFonts w:ascii="Times New Roman" w:hAnsi="Times New Roman" w:cs="Times New Roman"/>
+        </w:rPr>
+      </w:pPr>
+      <w:r>
+        <w:rPr>
+          <w:rFonts w:ascii="Times New Roman" w:hAnsi="Times New Roman" w:cs="Times New Roman"/>
+        </w:rPr>
+        <w:t>sales_transactions</w:t>
+      </w:r>
+      <w:r>
+        <w:rPr>
+          <w:rFonts w:ascii="Times New Roman" w:hAnsi="Times New Roman" w:cs="Times New Roman"/>
+        </w:rPr>
+        <w:t>:</w:t>
+      </w:r>
+      <w:r>
+        <w:rPr>
+          <w:rFonts w:ascii="Times New Roman" w:hAnsi="Times New Roman" w:cs="Times New Roman"/>
+        </w:rPr>
+        <w:t xml:space="preserve"> transaction_id, game_id, platform_id, region_id, sale_date, units_sold, sale_price</w:t>
+      </w:r>
+    </w:p>
+    <w:p>
+      <w:pPr>
+        <w:numPr>
+          <w:ilvl w:val="0"/>
+          <w:numId w:val="5"/>
+        </w:numPr>
+        <w:spacing w:line="480" w:lineRule="auto"/>
+        <w:rPr>
+          <w:rFonts w:ascii="Times New Roman" w:hAnsi="Times New Roman" w:cs="Times New Roman"/>
+        </w:rPr>
+      </w:pPr>
+      <w:r>
+        <w:rPr>
+          <w:rFonts w:ascii="Times New Roman" w:hAnsi="Times New Roman" w:cs="Times New Roman"/>
+        </w:rPr>
+        <w:t>regions</w:t>
+      </w:r>
+      <w:r>
+        <w:rPr>
+          <w:rFonts w:ascii="Times New Roman" w:hAnsi="Times New Roman" w:cs="Times New Roman"/>
+        </w:rPr>
+        <w:t>:</w:t>
+      </w:r>
+      <w:r>
+        <w:rPr>
+          <w:rFonts w:ascii="Times New Roman" w:hAnsi="Times New Roman" w:cs="Times New Roman"/>
+        </w:rPr>
+        <w:t xml:space="preserve"> region_id, region_name</w:t>
+      </w:r>
+    </w:p>
+    <w:p>
+      <w:pPr>
+        <w:spacing w:line="480" w:lineRule="auto"/>
+        <w:rPr>
+          <w:rFonts w:ascii="Times New Roman" w:hAnsi="Times New Roman" w:cs="Times New Roman"/>
+        </w:rPr>
+      </w:pPr>
+      <w:r>
+        <w:rPr>
+          <w:rFonts w:ascii="Times New Roman" w:hAnsi="Times New Roman" w:cs="Times New Roman"/>
+        </w:rPr>
+        <w:t>This OLTP schema is fully normalized</w:t>
+      </w:r>
+      <w:r>
+        <w:rPr>
+          <w:rFonts w:ascii="Times New Roman" w:hAnsi="Times New Roman" w:cs="Times New Roman"/>
+        </w:rPr>
+        <w:t>.</w:t>
+      </w:r>
+      <w:r>
+        <w:rPr>
+          <w:rFonts w:ascii="Times New Roman" w:hAnsi="Times New Roman" w:cs="Times New Roman"/>
+        </w:rPr>
+        <w:t xml:space="preserve"> </w:t>
+      </w:r>
+      <w:r>
+        <w:rPr>
+          <w:rFonts w:ascii="Times New Roman" w:hAnsi="Times New Roman" w:cs="Times New Roman"/>
+        </w:rPr>
+        <w:t>M</w:t>
+      </w:r>
+      <w:r>
+        <w:rPr>
+          <w:rFonts w:ascii="Times New Roman" w:hAnsi="Times New Roman" w:cs="Times New Roman"/>
+        </w:rPr>
+        <w:t>anufacturer is its own table separate from platform, and individual sale transactions are recorded row by row with a price and unit count</w:t>
+      </w:r>
+      <w:r>
+        <w:rPr>
+          <w:rFonts w:ascii="Times New Roman" w:hAnsi="Times New Roman" w:cs="Times New Roman"/>
+        </w:rPr>
+        <w:t xml:space="preserve">. The dw schema </w:t>
+      </w:r>
+      <w:r>
+        <w:rPr>
+          <w:rFonts w:ascii="Times New Roman" w:hAnsi="Times New Roman" w:cs="Times New Roman"/>
+        </w:rPr>
+        <w:t>collapses all of th</w:t>
+      </w:r>
+      <w:r>
+        <w:rPr>
+          <w:rFonts w:ascii="Times New Roman" w:hAnsi="Times New Roman" w:cs="Times New Roman"/>
+        </w:rPr>
+        <w:t>is</w:t>
+      </w:r>
+      <w:r>
+        <w:rPr>
+          <w:rFonts w:ascii="Times New Roman" w:hAnsi="Times New Roman" w:cs="Times New Roman"/>
+        </w:rPr>
+        <w:t xml:space="preserve"> into wide dimension tables and a single fact table aggregated at the </w:t>
+      </w:r>
+      <w:r>
+        <w:rPr>
+          <w:rFonts w:ascii="Times New Roman" w:hAnsi="Times New Roman" w:cs="Times New Roman"/>
+        </w:rPr>
+        <w:lastRenderedPageBreak/>
+        <w:t>game level</w:t>
+      </w:r>
+      <w:r>
+        <w:rPr>
+          <w:rFonts w:ascii="Times New Roman" w:hAnsi="Times New Roman" w:cs="Times New Roman"/>
+        </w:rPr>
+        <w:t>.</w:t>
+      </w:r>
+      <w:r>
+        <w:rPr>
+          <w:rFonts w:ascii="Times New Roman" w:hAnsi="Times New Roman" w:cs="Times New Roman"/>
+        </w:rPr>
+        <w:t xml:space="preserve"> The OLTP system could handle individual transactions per day and can handle fast writes, while the dw schema would be loaded periodically to handle analytical queries. </w:t>
+      </w:r>
+      <w:r>
+        <w:rPr>
+          <w:rFonts w:ascii="Times New Roman" w:hAnsi="Times New Roman" w:cs="Times New Roman"/>
+        </w:rPr>
+        <w:t>Queries on the OLTP system would be simple lookups like "how many units of GTA V sold today"</w:t>
+      </w:r>
+      <w:r>
+        <w:rPr>
+          <w:rFonts w:ascii="Times New Roman" w:hAnsi="Times New Roman" w:cs="Times New Roman"/>
+        </w:rPr>
+        <w:t xml:space="preserve"> while </w:t>
+      </w:r>
+      <w:r>
+        <w:rPr>
+          <w:rFonts w:ascii="Times New Roman" w:hAnsi="Times New Roman" w:cs="Times New Roman"/>
+        </w:rPr>
+        <w:t xml:space="preserve">queries on the </w:t>
+      </w:r>
+      <w:r>
+        <w:rPr>
+          <w:rFonts w:ascii="Times New Roman" w:hAnsi="Times New Roman" w:cs="Times New Roman"/>
+        </w:rPr>
+        <w:t xml:space="preserve">dw schema </w:t>
+      </w:r>
+      <w:r>
+        <w:rPr>
+          <w:rFonts w:ascii="Times New Roman" w:hAnsi="Times New Roman" w:cs="Times New Roman"/>
+        </w:rPr>
+        <w:t>answer broader questions like "which genre dominated sales in the 7th console generation"</w:t>
+      </w:r>
+    </w:p>
+    <w:p>
+      <w:pPr>
+        <w:spacing w:line="480" w:lineRule="auto"/>
+        <w:rPr>
+          <w:rFonts w:ascii="Times New Roman" w:hAnsi="Times New Roman" w:cs="Times New Roman"/>
+        </w:rPr>
+      </w:pPr>
+      <w:r>
+        <w:rPr>
+          <w:rFonts w:ascii="Times New Roman" w:hAnsi="Times New Roman" w:cs="Times New Roman"/>
+        </w:rPr>
+        <w:br w:type="page"/>
+      </w:r>
+    </w:p>
+    <w:p>
+      <w:pPr>
+        <w:spacing w:line="480" w:lineRule="auto"/>
+        <w:jc w:val="center"/>
+        <w:rPr>
+          <w:rFonts w:ascii="Times New Roman" w:hAnsi="Times New Roman" w:cs="Times New Roman"/>
+          <w:b/>
+          <w:bCs/>
+        </w:rPr>
+      </w:pPr>
+      <w:r>
+        <w:rPr>
+          <w:rFonts w:ascii="Times New Roman" w:hAnsi="Times New Roman" w:cs="Times New Roman"/>
+          <w:b/>
+          <w:bCs/>
+        </w:rPr>
+        <w:lastRenderedPageBreak/>
+        <w:t>Exploratory Data Analysis</w:t>
+      </w:r>
+    </w:p>
+    <w:p>
+      <w:pPr>
+        <w:spacing w:line="480" w:lineRule="auto"/>
+        <w:rPr>
+          <w:rFonts w:ascii="Times New Roman" w:hAnsi="Times New Roman" w:cs="Times New Roman"/>
+        </w:rPr>
+      </w:pPr>
+      <w:r>
+        <w:rPr>
+          <w:rFonts w:ascii="Times New Roman" w:hAnsi="Times New Roman" w:cs="Times New Roman"/>
+        </w:rPr>
+        <w:t>Here I will go through the queries</w:t>
+      </w:r>
+      <w:r>
+        <w:rPr>
+          <w:rFonts w:ascii="Times New Roman" w:hAnsi="Times New Roman" w:cs="Times New Roman"/>
+        </w:rPr>
+        <w:t xml:space="preserve"> I split up the queries into 3 topics; game trends over time, differences between platforms, and critic scores vs sales.</w:t>
+      </w:r>
+    </w:p>
+    <w:p>
+      <w:pPr>
+        <w:spacing w:line="480" w:lineRule="auto"/>
+        <w:rPr>
+          <w:rFonts w:ascii="Times New Roman" w:hAnsi="Times New Roman" w:cs="Times New Roman"/>
+          <w:b/>
+          <w:bCs/>
+        </w:rPr>
+      </w:pPr>
+      <w:r>
+        <w:rPr>
+          <w:rFonts w:ascii="Times New Roman" w:hAnsi="Times New Roman" w:cs="Times New Roman"/>
+          <w:b/>
+          <w:bCs/>
+        </w:rPr>
+        <w:t xml:space="preserve">Topic 1, </w:t>
+      </w:r>
+      <w:r>
+        <w:rPr>
+          <w:rFonts w:ascii="Times New Roman" w:hAnsi="Times New Roman" w:cs="Times New Roman"/>
+          <w:b/>
+          <w:bCs/>
+        </w:rPr>
+        <w:t>Game Trends Over Time</w:t>
+      </w:r>
+      <w:r>
+        <w:rPr>
+          <w:rFonts w:ascii="Times New Roman" w:hAnsi="Times New Roman" w:cs="Times New Roman"/>
+          <w:b/>
+          <w:bCs/>
+        </w:rPr>
+        <w:t>:</w:t>
+      </w:r>
+    </w:p>
+    <w:p>
+      <w:pPr>
+        <w:spacing w:line="480" w:lineRule="auto"/>
+        <w:rPr>
+          <w:rFonts w:ascii="Times New Roman" w:hAnsi="Times New Roman" w:cs="Times New Roman"/>
+        </w:rPr>
+      </w:pPr>
+      <w:r>
+        <w:rPr>
+          <w:rFonts w:ascii="Times New Roman" w:hAnsi="Times New Roman" w:cs="Times New Roman"/>
+        </w:rPr>
+        <w:t>Query 1, Top genre per era:</w:t>
+      </w:r>
+    </w:p>
+    <w:p>
+      <w:pPr>
+        <w:spacing w:line="480" w:lineRule="auto"/>
+        <w:rPr>
+          <w:rFonts w:ascii="Times New Roman" w:hAnsi="Times New Roman" w:cs="Times New Roman"/>
+        </w:rPr>
+      </w:pPr>
+      <w:r>
+        <w:rPr>
+          <w:rFonts w:ascii="Times New Roman" w:hAnsi="Times New Roman" w:cs="Times New Roman"/>
+          <w:noProof/>
+        </w:rPr>
+        <w:drawing>
+          <wp:inline distT="0" distB="0" distL="0" distR="0" wp14:anchorId="6EA7999A" wp14:editId="30FBB5B7">
+            <wp:extent cx="5744150" cy="4297680"/>
+            <wp:effectExtent l="0" t="0" r="9525" b="7620"/>
+            <wp:docPr id="1515431609" name="Picture 1"/>
+            <wp:cNvGraphicFramePr>
+              <a:graphicFrameLocks xmlns:a="http://schemas.openxmlformats.org/drawingml/2006/main" noChangeAspect="1"/>
+            </wp:cNvGraphicFramePr>
+            <a:graphic xmlns:a="http://schemas.openxmlformats.org/drawingml/2006/main">
+              <a:graphicData uri="http://schemas.openxmlformats.org/drawingml/2006/picture">
+                <pic:pic xmlns:pic="http://schemas.openxmlformats.org/drawingml/2006/picture">
+                  <pic:nvPicPr>
+                    <pic:cNvPr id="1515431609" name=""/>
+                    <pic:cNvPicPr/>
+                  </pic:nvPicPr>
+                  <pic:blipFill>
+                    <a:blip r:embed="rId9"/>
+                    <a:stretch>
+                      <a:fillRect/>
+                    </a:stretch>
+                  </pic:blipFill>
+                  <pic:spPr>
+                    <a:xfrm>
+                      <a:off x="0" y="0"/>
+                      <a:ext cx="5759819" cy="4309403"/>
+                    </a:xfrm>
+                    <a:prstGeom prst="rect">
+                      <a:avLst/>
+                    </a:prstGeom>
+                  </pic:spPr>
+                </pic:pic>
+              </a:graphicData>
+            </a:graphic>
+          </wp:inline>
+        </w:drawing>
+      </w:r>
+    </w:p>
+    <w:p>
+      <w:pPr>
+        <w:spacing w:line="480" w:lineRule="auto"/>
+        <w:rPr>
+          <w:rFonts w:ascii="Times New Roman" w:hAnsi="Times New Roman" w:cs="Times New Roman"/>
+        </w:rPr>
+      </w:pPr>
+      <w:r>
+        <w:rPr>
+          <w:rFonts w:ascii="Times New Roman" w:hAnsi="Times New Roman" w:cs="Times New Roman"/>
+          <w:noProof/>
+        </w:rPr>
+        <w:lastRenderedPageBreak/>
+        <w:drawing>
+          <wp:inline distT="0" distB="0" distL="0" distR="0" wp14:anchorId="27389CC8" wp14:editId="3389C4D3">
+            <wp:extent cx="5943600" cy="3462655"/>
+            <wp:effectExtent l="0" t="0" r="0" b="4445"/>
+            <wp:docPr id="1341348681" name="Picture 1"/>
+            <wp:cNvGraphicFramePr>
+              <a:graphicFrameLocks xmlns:a="http://schemas.openxmlformats.org/drawingml/2006/main" noChangeAspect="1"/>
+            </wp:cNvGraphicFramePr>
+            <a:graphic xmlns:a="http://schemas.openxmlformats.org/drawingml/2006/main">
+              <a:graphicData uri="http://schemas.openxmlformats.org/drawingml/2006/picture">
+                <pic:pic xmlns:pic="http://schemas.openxmlformats.org/drawingml/2006/picture">
+                  <pic:nvPicPr>
+                    <pic:cNvPr id="1341348681" name=""/>
+                    <pic:cNvPicPr/>
+                  </pic:nvPicPr>
+                  <pic:blipFill>
+                    <a:blip r:embed="rId10"/>
+                    <a:stretch>
+                      <a:fillRect/>
+                    </a:stretch>
+                  </pic:blipFill>
+                  <pic:spPr>
+                    <a:xfrm>
+                      <a:off x="0" y="0"/>
+                      <a:ext cx="5943600" cy="3462655"/>
+                    </a:xfrm>
+                    <a:prstGeom prst="rect">
+                      <a:avLst/>
+                    </a:prstGeom>
+                  </pic:spPr>
+                </pic:pic>
+              </a:graphicData>
+            </a:graphic>
+          </wp:inline>
+        </w:drawing>
+      </w:r>
+    </w:p>
+    <w:p>
+      <w:pPr>
+        <w:spacing w:line="480" w:lineRule="auto"/>
+        <w:rPr>
+          <w:rFonts w:ascii="Times New Roman" w:hAnsi="Times New Roman" w:cs="Times New Roman"/>
+        </w:rPr>
+      </w:pPr>
+      <w:r>
+        <w:rPr>
+          <w:rFonts w:ascii="Times New Roman" w:hAnsi="Times New Roman" w:cs="Times New Roman"/>
+        </w:rPr>
+        <w:t xml:space="preserve">These are the top 3 genres in terms of sales for each generation. This is an interesting query as it shows changes in genre interest over time and what genres stay popular. For example, we can see that in the early days of video games, puzzle games were </w:t>
+      </w:r>
+      <w:r>
+        <w:rPr>
+          <w:rFonts w:ascii="Times New Roman" w:hAnsi="Times New Roman" w:cs="Times New Roman"/>
+        </w:rPr>
+        <w:t xml:space="preserve">a high seller, but as games became more sophisticated that fell out. Shooter and Action games are constantly in the top 3 of most generations showing how popular they are as genres. </w:t>
+      </w:r>
+    </w:p>
+    <w:p>
+      <w:pPr>
+        <w:spacing w:line="480" w:lineRule="auto"/>
+        <w:rPr>
+          <w:rFonts w:ascii="Times New Roman" w:hAnsi="Times New Roman" w:cs="Times New Roman"/>
+        </w:rPr>
+      </w:pPr>
+      <w:r>
+        <w:rPr>
+          <w:rFonts w:ascii="Times New Roman" w:hAnsi="Times New Roman" w:cs="Times New Roman"/>
+        </w:rPr>
+        <w:t>Query 2, fastest growing genres between the 2000s and the 2010s</w:t>
+      </w:r>
+      <w:r>
+        <w:rPr>
+          <w:rFonts w:ascii="Times New Roman" w:hAnsi="Times New Roman" w:cs="Times New Roman"/>
+        </w:rPr>
+        <w:t>:</w:t>
+      </w:r>
+    </w:p>
+    <w:p>
+      <w:pPr>
+        <w:spacing w:line="480" w:lineRule="auto"/>
+        <w:rPr>
+          <w:rFonts w:ascii="Times New Roman" w:hAnsi="Times New Roman" w:cs="Times New Roman"/>
+        </w:rPr>
+      </w:pPr>
+      <w:r>
+        <w:rPr>
+          <w:rFonts w:ascii="Times New Roman" w:hAnsi="Times New Roman" w:cs="Times New Roman"/>
+          <w:noProof/>
+        </w:rPr>
+        <w:drawing>
+          <wp:inline distT="0" distB="0" distL="0" distR="0" wp14:anchorId="06707344" wp14:editId="235E80FF">
+            <wp:extent cx="4411265" cy="2171700"/>
+            <wp:effectExtent l="0" t="0" r="8890" b="0"/>
+            <wp:docPr id="887650297" name="Picture 1"/>
+            <wp:cNvGraphicFramePr>
+              <a:graphicFrameLocks xmlns:a="http://schemas.openxmlformats.org/drawingml/2006/main" noChangeAspect="1"/>
+            </wp:cNvGraphicFramePr>
+            <a:graphic xmlns:a="http://schemas.openxmlformats.org/drawingml/2006/main">
+              <a:graphicData uri="http://schemas.openxmlformats.org/drawingml/2006/picture">
+                <pic:pic xmlns:pic="http://schemas.openxmlformats.org/drawingml/2006/picture">
+                  <pic:nvPicPr>
+                    <pic:cNvPr id="887650297" name=""/>
+                    <pic:cNvPicPr/>
+                  </pic:nvPicPr>
+                  <pic:blipFill>
+                    <a:blip r:embed="rId11"/>
+                    <a:stretch>
+                      <a:fillRect/>
+                    </a:stretch>
+                  </pic:blipFill>
+                  <pic:spPr>
+                    <a:xfrm>
+                      <a:off x="0" y="0"/>
+                      <a:ext cx="4424056" cy="2177997"/>
+                    </a:xfrm>
+                    <a:prstGeom prst="rect">
+                      <a:avLst/>
+                    </a:prstGeom>
+                  </pic:spPr>
+                </pic:pic>
+              </a:graphicData>
+            </a:graphic>
+          </wp:inline>
+        </w:drawing>
+      </w:r>
+    </w:p>
+    <w:p>
+      <w:pPr>
+        <w:spacing w:line="480" w:lineRule="auto"/>
+        <w:rPr>
+          <w:rFonts w:ascii="Times New Roman" w:hAnsi="Times New Roman" w:cs="Times New Roman"/>
+        </w:rPr>
+      </w:pPr>
+      <w:r>
+        <w:rPr>
+          <w:rFonts w:ascii="Times New Roman" w:hAnsi="Times New Roman" w:cs="Times New Roman"/>
+          <w:noProof/>
+        </w:rPr>
+        <w:lastRenderedPageBreak/>
+        <w:drawing>
+          <wp:inline distT="0" distB="0" distL="0" distR="0" wp14:anchorId="2074F9A0" wp14:editId="3BFAE58A">
+            <wp:extent cx="4503420" cy="2637099"/>
+            <wp:effectExtent l="0" t="0" r="0" b="0"/>
+            <wp:docPr id="1329756947" name="Picture 1"/>
+            <wp:cNvGraphicFramePr>
+              <a:graphicFrameLocks xmlns:a="http://schemas.openxmlformats.org/drawingml/2006/main" noChangeAspect="1"/>
+            </wp:cNvGraphicFramePr>
+            <a:graphic xmlns:a="http://schemas.openxmlformats.org/drawingml/2006/main">
+              <a:graphicData uri="http://schemas.openxmlformats.org/drawingml/2006/picture">
+                <pic:pic xmlns:pic="http://schemas.openxmlformats.org/drawingml/2006/picture">
+                  <pic:nvPicPr>
+                    <pic:cNvPr id="1329756947" name=""/>
+                    <pic:cNvPicPr/>
+                  </pic:nvPicPr>
+                  <pic:blipFill>
+                    <a:blip r:embed="rId12"/>
+                    <a:stretch>
+                      <a:fillRect/>
+                    </a:stretch>
+                  </pic:blipFill>
+                  <pic:spPr>
+                    <a:xfrm>
+                      <a:off x="0" y="0"/>
+                      <a:ext cx="4514924" cy="2643835"/>
+                    </a:xfrm>
+                    <a:prstGeom prst="rect">
+                      <a:avLst/>
+                    </a:prstGeom>
+                  </pic:spPr>
+                </pic:pic>
+              </a:graphicData>
+            </a:graphic>
+          </wp:inline>
+        </w:drawing>
+      </w:r>
+    </w:p>
+    <w:p>
+      <w:pPr>
+        <w:spacing w:line="480" w:lineRule="auto"/>
+        <w:rPr>
+          <w:rFonts w:ascii="Times New Roman" w:hAnsi="Times New Roman" w:cs="Times New Roman"/>
+        </w:rPr>
+      </w:pPr>
+      <w:r>
+        <w:rPr>
+          <w:rFonts w:ascii="Times New Roman" w:hAnsi="Times New Roman" w:cs="Times New Roman"/>
+        </w:rPr>
+        <w:t xml:space="preserve">In this query we can see the boom in sales for the sales of action-adventure games from the 2000s to the 2010s. This could be because of the rise of the genre, as in the 2000s there were more only action games, while the action-adventure genre as a whole boomed. We can also see the introduction of sandbox and board game genre games in the 2010s in the data set, as well as the fall off of platform, racing and simulation games. </w:t>
+      </w:r>
+    </w:p>
+    <w:p>
+      <w:pPr>
+        <w:spacing w:line="480" w:lineRule="auto"/>
+        <w:rPr>
+          <w:rFonts w:ascii="Times New Roman" w:hAnsi="Times New Roman" w:cs="Times New Roman"/>
+          <w:b/>
+          <w:bCs/>
+        </w:rPr>
+      </w:pPr>
+      <w:r>
+        <w:rPr>
+          <w:rFonts w:ascii="Times New Roman" w:hAnsi="Times New Roman" w:cs="Times New Roman"/>
+          <w:b/>
+          <w:bCs/>
+        </w:rPr>
+        <w:t>Topic 2, Differences Between Platforms:</w:t>
+      </w:r>
+    </w:p>
+    <w:p>
+      <w:pPr>
+        <w:spacing w:line="480" w:lineRule="auto"/>
+        <w:rPr>
+          <w:rFonts w:ascii="Times New Roman" w:hAnsi="Times New Roman" w:cs="Times New Roman"/>
+        </w:rPr>
+      </w:pPr>
+      <w:r>
+        <w:rPr>
+          <w:rFonts w:ascii="Times New Roman" w:hAnsi="Times New Roman" w:cs="Times New Roman"/>
+        </w:rPr>
+        <w:t>Query 3, the big 3 companies ranked in terms of sales</w:t>
+      </w:r>
+      <w:r>
+        <w:rPr>
+          <w:rFonts w:ascii="Times New Roman" w:hAnsi="Times New Roman" w:cs="Times New Roman"/>
+        </w:rPr>
+        <w:t>:</w:t>
+      </w:r>
+    </w:p>
+    <w:p>
+      <w:pPr>
+        <w:spacing w:line="480" w:lineRule="auto"/>
+        <w:rPr>
+          <w:rFonts w:ascii="Times New Roman" w:hAnsi="Times New Roman" w:cs="Times New Roman"/>
+          <w:b/>
+          <w:bCs/>
+        </w:rPr>
+      </w:pPr>
+      <w:r>
+        <w:rPr>
+          <w:rFonts w:ascii="Times New Roman" w:hAnsi="Times New Roman" w:cs="Times New Roman"/>
+          <w:b/>
+          <w:bCs/>
+          <w:noProof/>
+        </w:rPr>
+        <w:drawing>
+          <wp:inline distT="0" distB="0" distL="0" distR="0" wp14:anchorId="5D24E5C7" wp14:editId="5B4DE43A">
+            <wp:extent cx="4168140" cy="1937116"/>
+            <wp:effectExtent l="0" t="0" r="3810" b="6350"/>
+            <wp:docPr id="1110735974" name="Picture 1"/>
+            <wp:cNvGraphicFramePr>
+              <a:graphicFrameLocks xmlns:a="http://schemas.openxmlformats.org/drawingml/2006/main" noChangeAspect="1"/>
+            </wp:cNvGraphicFramePr>
+            <a:graphic xmlns:a="http://schemas.openxmlformats.org/drawingml/2006/main">
+              <a:graphicData uri="http://schemas.openxmlformats.org/drawingml/2006/picture">
+                <pic:pic xmlns:pic="http://schemas.openxmlformats.org/drawingml/2006/picture">
+                  <pic:nvPicPr>
+                    <pic:cNvPr id="1110735974" name=""/>
+                    <pic:cNvPicPr/>
+                  </pic:nvPicPr>
+                  <pic:blipFill>
+                    <a:blip r:embed="rId13"/>
+                    <a:stretch>
+                      <a:fillRect/>
+                    </a:stretch>
+                  </pic:blipFill>
+                  <pic:spPr>
+                    <a:xfrm>
+                      <a:off x="0" y="0"/>
+                      <a:ext cx="4176779" cy="1941131"/>
+                    </a:xfrm>
+                    <a:prstGeom prst="rect">
+                      <a:avLst/>
+                    </a:prstGeom>
+                  </pic:spPr>
+                </pic:pic>
+              </a:graphicData>
+            </a:graphic>
+          </wp:inline>
+        </w:drawing>
+      </w:r>
+    </w:p>
+    <w:p>
+      <w:pPr>
+        <w:spacing w:line="480" w:lineRule="auto"/>
+        <w:rPr>
+          <w:rFonts w:ascii="Times New Roman" w:hAnsi="Times New Roman" w:cs="Times New Roman"/>
+          <w:b/>
+          <w:bCs/>
+        </w:rPr>
+      </w:pPr>
+      <w:r>
+        <w:rPr>
+          <w:rFonts w:ascii="Times New Roman" w:hAnsi="Times New Roman" w:cs="Times New Roman"/>
+          <w:b/>
+          <w:bCs/>
+          <w:noProof/>
+        </w:rPr>
+        <w:lastRenderedPageBreak/>
+        <w:drawing>
+          <wp:inline distT="0" distB="0" distL="0" distR="0" wp14:anchorId="43FF3A97" wp14:editId="6B5E1AC9">
+            <wp:extent cx="5943600" cy="686435"/>
+            <wp:effectExtent l="0" t="0" r="0" b="0"/>
+            <wp:docPr id="150484449" name="Picture 1"/>
+            <wp:cNvGraphicFramePr>
+              <a:graphicFrameLocks xmlns:a="http://schemas.openxmlformats.org/drawingml/2006/main" noChangeAspect="1"/>
+            </wp:cNvGraphicFramePr>
+            <a:graphic xmlns:a="http://schemas.openxmlformats.org/drawingml/2006/main">
+              <a:graphicData uri="http://schemas.openxmlformats.org/drawingml/2006/picture">
+                <pic:pic xmlns:pic="http://schemas.openxmlformats.org/drawingml/2006/picture">
+                  <pic:nvPicPr>
+                    <pic:cNvPr id="150484449" name=""/>
+                    <pic:cNvPicPr/>
+                  </pic:nvPicPr>
+                  <pic:blipFill>
+                    <a:blip r:embed="rId14"/>
+                    <a:stretch>
+                      <a:fillRect/>
+                    </a:stretch>
+                  </pic:blipFill>
+                  <pic:spPr>
+                    <a:xfrm>
+                      <a:off x="0" y="0"/>
+                      <a:ext cx="5943600" cy="686435"/>
+                    </a:xfrm>
+                    <a:prstGeom prst="rect">
+                      <a:avLst/>
+                    </a:prstGeom>
+                  </pic:spPr>
+                </pic:pic>
+              </a:graphicData>
+            </a:graphic>
+          </wp:inline>
+        </w:drawing>
+      </w:r>
+    </w:p>
+    <w:p>
+      <w:pPr>
+        <w:spacing w:line="480" w:lineRule="auto"/>
+        <w:rPr>
+          <w:rFonts w:ascii="Times New Roman" w:hAnsi="Times New Roman" w:cs="Times New Roman"/>
+        </w:rPr>
+      </w:pPr>
+      <w:r>
+        <w:rPr>
+          <w:rFonts w:ascii="Times New Roman" w:hAnsi="Times New Roman" w:cs="Times New Roman"/>
+        </w:rPr>
+        <w:t>Really straightforward query that shows Sony has the most sales compared to the other 2 companies</w:t>
+      </w:r>
+      <w:r>
+        <w:rPr>
+          <w:rFonts w:ascii="Times New Roman" w:hAnsi="Times New Roman" w:cs="Times New Roman"/>
+        </w:rPr>
+        <w:t xml:space="preserve"> with over $3 Billion</w:t>
+      </w:r>
+      <w:r>
+        <w:rPr>
+          <w:rFonts w:ascii="Times New Roman" w:hAnsi="Times New Roman" w:cs="Times New Roman"/>
+        </w:rPr>
+        <w:t xml:space="preserve">. It is also important to </w:t>
+      </w:r>
+      <w:r>
+        <w:rPr>
+          <w:rFonts w:ascii="Times New Roman" w:hAnsi="Times New Roman" w:cs="Times New Roman"/>
+        </w:rPr>
+        <w:t>note</w:t>
+      </w:r>
+      <w:r>
+        <w:rPr>
+          <w:rFonts w:ascii="Times New Roman" w:hAnsi="Times New Roman" w:cs="Times New Roman"/>
+        </w:rPr>
+        <w:t xml:space="preserve"> that Microsoft has the least sales, however also the least </w:t>
+      </w:r>
+      <w:r>
+        <w:rPr>
+          <w:rFonts w:ascii="Times New Roman" w:hAnsi="Times New Roman" w:cs="Times New Roman"/>
+        </w:rPr>
+        <w:t>number</w:t>
+      </w:r>
+      <w:r>
+        <w:rPr>
+          <w:rFonts w:ascii="Times New Roman" w:hAnsi="Times New Roman" w:cs="Times New Roman"/>
+        </w:rPr>
+        <w:t xml:space="preserve"> of titles, so they actually have </w:t>
+      </w:r>
+      <w:r>
+        <w:rPr>
+          <w:rFonts w:ascii="Times New Roman" w:hAnsi="Times New Roman" w:cs="Times New Roman"/>
+        </w:rPr>
+        <w:t>higher</w:t>
+      </w:r>
+      <w:r>
+        <w:rPr>
+          <w:rFonts w:ascii="Times New Roman" w:hAnsi="Times New Roman" w:cs="Times New Roman"/>
+        </w:rPr>
+        <w:t xml:space="preserve"> average sales per title, possibl</w:t>
+      </w:r>
+      <w:r>
+        <w:rPr>
+          <w:rFonts w:ascii="Times New Roman" w:hAnsi="Times New Roman" w:cs="Times New Roman"/>
+        </w:rPr>
+        <w:t>y</w:t>
+      </w:r>
+      <w:r>
+        <w:rPr>
+          <w:rFonts w:ascii="Times New Roman" w:hAnsi="Times New Roman" w:cs="Times New Roman"/>
+        </w:rPr>
+        <w:t xml:space="preserve"> showing a higher quality of game be title</w:t>
+      </w:r>
+      <w:r>
+        <w:rPr>
+          <w:rFonts w:ascii="Times New Roman" w:hAnsi="Times New Roman" w:cs="Times New Roman"/>
+        </w:rPr>
+        <w:t xml:space="preserve">. </w:t>
+      </w:r>
+    </w:p>
+    <w:p>
+      <w:pPr>
+        <w:spacing w:line="480" w:lineRule="auto"/>
+        <w:rPr>
+          <w:rFonts w:ascii="Times New Roman" w:hAnsi="Times New Roman" w:cs="Times New Roman"/>
+        </w:rPr>
+      </w:pPr>
+    </w:p>
+    <w:p>
+      <w:pPr>
+        <w:spacing w:line="480" w:lineRule="auto"/>
+        <w:rPr>
+          <w:rFonts w:ascii="Times New Roman" w:hAnsi="Times New Roman" w:cs="Times New Roman"/>
+        </w:rPr>
+      </w:pPr>
+      <w:r>
+        <w:rPr>
+          <w:rFonts w:ascii="Times New Roman" w:hAnsi="Times New Roman" w:cs="Times New Roman"/>
+        </w:rPr>
+        <w:t>Query 4, Ranking each company’s platform into quadrants</w:t>
+      </w:r>
+      <w:r>
+        <w:rPr>
+          <w:rFonts w:ascii="Times New Roman" w:hAnsi="Times New Roman" w:cs="Times New Roman"/>
+        </w:rPr>
+        <w:t>:</w:t>
+      </w:r>
+    </w:p>
+    <w:p>
+      <w:pPr>
+        <w:spacing w:line="480" w:lineRule="auto"/>
+        <w:rPr>
+          <w:rFonts w:ascii="Times New Roman" w:hAnsi="Times New Roman" w:cs="Times New Roman"/>
+          <w:b/>
+          <w:bCs/>
+        </w:rPr>
+      </w:pPr>
+      <w:r>
+        <w:rPr>
+          <w:rFonts w:ascii="Times New Roman" w:hAnsi="Times New Roman" w:cs="Times New Roman"/>
+          <w:b/>
+          <w:bCs/>
+          <w:noProof/>
+        </w:rPr>
+        <w:drawing>
+          <wp:inline distT="0" distB="0" distL="0" distR="0" wp14:anchorId="1394EB9A" wp14:editId="04B902D4">
+            <wp:extent cx="5262754" cy="2179320"/>
+            <wp:effectExtent l="0" t="0" r="0" b="0"/>
+            <wp:docPr id="863094447" name="Picture 1"/>
+            <wp:cNvGraphicFramePr>
+              <a:graphicFrameLocks xmlns:a="http://schemas.openxmlformats.org/drawingml/2006/main" noChangeAspect="1"/>
+            </wp:cNvGraphicFramePr>
+            <a:graphic xmlns:a="http://schemas.openxmlformats.org/drawingml/2006/main">
+              <a:graphicData uri="http://schemas.openxmlformats.org/drawingml/2006/picture">
+                <pic:pic xmlns:pic="http://schemas.openxmlformats.org/drawingml/2006/picture">
+                  <pic:nvPicPr>
+                    <pic:cNvPr id="863094447" name=""/>
+                    <pic:cNvPicPr/>
+                  </pic:nvPicPr>
+                  <pic:blipFill>
+                    <a:blip r:embed="rId15"/>
+                    <a:stretch>
+                      <a:fillRect/>
+                    </a:stretch>
+                  </pic:blipFill>
+                  <pic:spPr>
+                    <a:xfrm>
+                      <a:off x="0" y="0"/>
+                      <a:ext cx="5266728" cy="2180966"/>
+                    </a:xfrm>
+                    <a:prstGeom prst="rect">
+                      <a:avLst/>
+                    </a:prstGeom>
+                  </pic:spPr>
+                </pic:pic>
+              </a:graphicData>
+            </a:graphic>
+          </wp:inline>
+        </w:drawing>
+      </w:r>
+    </w:p>
+    <w:p>
+      <w:pPr>
+        <w:spacing w:line="480" w:lineRule="auto"/>
+        <w:rPr>
+          <w:rFonts w:ascii="Times New Roman" w:hAnsi="Times New Roman" w:cs="Times New Roman"/>
+          <w:b/>
+          <w:bCs/>
+        </w:rPr>
+      </w:pPr>
+      <w:r>
+        <w:rPr>
+          <w:rFonts w:ascii="Times New Roman" w:hAnsi="Times New Roman" w:cs="Times New Roman"/>
+          <w:b/>
+          <w:bCs/>
+          <w:noProof/>
+        </w:rPr>
+        <w:drawing>
+          <wp:inline distT="0" distB="0" distL="0" distR="0" wp14:anchorId="70CAD8A9" wp14:editId="26254FC4">
+            <wp:extent cx="4981252" cy="2369820"/>
+            <wp:effectExtent l="0" t="0" r="0" b="0"/>
+            <wp:docPr id="1437128281" name="Picture 1"/>
+            <wp:cNvGraphicFramePr>
+              <a:graphicFrameLocks xmlns:a="http://schemas.openxmlformats.org/drawingml/2006/main" noChangeAspect="1"/>
+            </wp:cNvGraphicFramePr>
+            <a:graphic xmlns:a="http://schemas.openxmlformats.org/drawingml/2006/main">
+              <a:graphicData uri="http://schemas.openxmlformats.org/drawingml/2006/picture">
+                <pic:pic xmlns:pic="http://schemas.openxmlformats.org/drawingml/2006/picture">
+                  <pic:nvPicPr>
+                    <pic:cNvPr id="1437128281" name=""/>
+                    <pic:cNvPicPr/>
+                  </pic:nvPicPr>
+                  <pic:blipFill>
+                    <a:blip r:embed="rId16"/>
+                    <a:stretch>
+                      <a:fillRect/>
+                    </a:stretch>
+                  </pic:blipFill>
+                  <pic:spPr>
+                    <a:xfrm>
+                      <a:off x="0" y="0"/>
+                      <a:ext cx="4984582" cy="2371404"/>
+                    </a:xfrm>
+                    <a:prstGeom prst="rect">
+                      <a:avLst/>
+                    </a:prstGeom>
+                  </pic:spPr>
+                </pic:pic>
+              </a:graphicData>
+            </a:graphic>
+          </wp:inline>
+        </w:drawing>
+      </w:r>
+    </w:p>
+    <w:p>
+      <w:pPr>
+        <w:spacing w:line="480" w:lineRule="auto"/>
+        <w:rPr>
+          <w:rFonts w:ascii="Times New Roman" w:hAnsi="Times New Roman" w:cs="Times New Roman"/>
+        </w:rPr>
+      </w:pPr>
+      <w:r>
+        <w:rPr>
+          <w:rFonts w:ascii="Times New Roman" w:hAnsi="Times New Roman" w:cs="Times New Roman"/>
+        </w:rPr>
+        <w:lastRenderedPageBreak/>
+        <w:t xml:space="preserve">This query </w:t>
+      </w:r>
+      <w:r>
+        <w:rPr>
+          <w:rFonts w:ascii="Times New Roman" w:hAnsi="Times New Roman" w:cs="Times New Roman"/>
+        </w:rPr>
+        <w:t xml:space="preserve">takes each platform for each of the companies and ranks them based </w:t>
+      </w:r>
+      <w:r>
+        <w:rPr>
+          <w:rFonts w:ascii="Times New Roman" w:hAnsi="Times New Roman" w:cs="Times New Roman"/>
+        </w:rPr>
+        <w:t>on</w:t>
+      </w:r>
+      <w:r>
+        <w:rPr>
+          <w:rFonts w:ascii="Times New Roman" w:hAnsi="Times New Roman" w:cs="Times New Roman"/>
+        </w:rPr>
+        <w:t xml:space="preserve"> the sales associated with their games. In the 4</w:t>
+      </w:r>
+      <w:r>
+        <w:rPr>
+          <w:rFonts w:ascii="Times New Roman" w:hAnsi="Times New Roman" w:cs="Times New Roman"/>
+          <w:vertAlign w:val="superscript"/>
+        </w:rPr>
+        <w:t>th</w:t>
+      </w:r>
+      <w:r>
+        <w:rPr>
+          <w:rFonts w:ascii="Times New Roman" w:hAnsi="Times New Roman" w:cs="Times New Roman"/>
+        </w:rPr>
+        <w:t xml:space="preserve"> quadrant those are the platforms that sold the most games, we can see some really popular systems like the PlayStation 2, Xbox 360 and the Nintendo Wii. Quadrant 1 has systems whose games sold the least, which also corresponds to less popular systems like the PlayStation Vita, and Nintendo Virtual Console. </w:t>
+      </w:r>
+      <w:r>
+        <w:rPr>
+          <w:rFonts w:ascii="Times New Roman" w:hAnsi="Times New Roman" w:cs="Times New Roman"/>
+        </w:rPr>
+        <w:t xml:space="preserve">The 4 quadrants are made using NTILE </w:t>
+      </w:r>
+      <w:r>
+        <w:rPr>
+          <w:rFonts w:ascii="Times New Roman" w:hAnsi="Times New Roman" w:cs="Times New Roman"/>
+        </w:rPr>
+        <w:t>window function, which divides each manufacturer's platforms into four equal buckets ranked by total sales</w:t>
+      </w:r>
+    </w:p>
+    <w:p>
+      <w:pPr>
+        <w:spacing w:line="480" w:lineRule="auto"/>
+        <w:rPr>
+          <w:rFonts w:ascii="Times New Roman" w:hAnsi="Times New Roman" w:cs="Times New Roman"/>
+          <w:b/>
+          <w:bCs/>
+        </w:rPr>
+      </w:pPr>
+    </w:p>
+    <w:p>
+      <w:pPr>
+        <w:spacing w:line="480" w:lineRule="auto"/>
+        <w:rPr>
+          <w:rFonts w:ascii="Times New Roman" w:hAnsi="Times New Roman" w:cs="Times New Roman"/>
+          <w:b/>
+          <w:bCs/>
+        </w:rPr>
+      </w:pPr>
+      <w:r>
+        <w:rPr>
+          <w:rFonts w:ascii="Times New Roman" w:hAnsi="Times New Roman" w:cs="Times New Roman"/>
+          <w:b/>
+          <w:bCs/>
+        </w:rPr>
+        <w:t>Topic 3, Critic Score vs Sales:</w:t>
+      </w:r>
+    </w:p>
+    <w:p>
+      <w:pPr>
+        <w:spacing w:line="480" w:lineRule="auto"/>
+        <w:rPr>
+          <w:rFonts w:ascii="Times New Roman" w:hAnsi="Times New Roman" w:cs="Times New Roman"/>
+        </w:rPr>
+      </w:pPr>
+      <w:r>
+        <w:rPr>
+          <w:rFonts w:ascii="Times New Roman" w:hAnsi="Times New Roman" w:cs="Times New Roman"/>
+        </w:rPr>
+        <w:t>Query 5, Do critic scores translate to sales</w:t>
+      </w:r>
+      <w:r>
+        <w:rPr>
+          <w:rFonts w:ascii="Times New Roman" w:hAnsi="Times New Roman" w:cs="Times New Roman"/>
+        </w:rPr>
+        <w:t>:</w:t>
+      </w:r>
+    </w:p>
+    <w:p>
+      <w:pPr>
+        <w:spacing w:line="480" w:lineRule="auto"/>
+        <w:rPr>
+          <w:rFonts w:ascii="Times New Roman" w:hAnsi="Times New Roman" w:cs="Times New Roman"/>
+          <w:b/>
+          <w:bCs/>
+        </w:rPr>
+      </w:pPr>
+      <w:r>
+        <w:rPr>
+          <w:rFonts w:ascii="Times New Roman" w:hAnsi="Times New Roman" w:cs="Times New Roman"/>
+          <w:b/>
+          <w:bCs/>
+          <w:noProof/>
+        </w:rPr>
+        <w:drawing>
+          <wp:inline distT="0" distB="0" distL="0" distR="0" wp14:anchorId="2E9CF688" wp14:editId="56AA968C">
+            <wp:extent cx="5906324" cy="2705478"/>
+            <wp:effectExtent l="0" t="0" r="0" b="0"/>
+            <wp:docPr id="526822311" name="Picture 1"/>
+            <wp:cNvGraphicFramePr>
+              <a:graphicFrameLocks xmlns:a="http://schemas.openxmlformats.org/drawingml/2006/main" noChangeAspect="1"/>
+            </wp:cNvGraphicFramePr>
+            <a:graphic xmlns:a="http://schemas.openxmlformats.org/drawingml/2006/main">
+              <a:graphicData uri="http://schemas.openxmlformats.org/drawingml/2006/picture">
+                <pic:pic xmlns:pic="http://schemas.openxmlformats.org/drawingml/2006/picture">
+                  <pic:nvPicPr>
+                    <pic:cNvPr id="526822311" name=""/>
+                    <pic:cNvPicPr/>
+                  </pic:nvPicPr>
+                  <pic:blipFill>
+                    <a:blip r:embed="rId17"/>
+                    <a:stretch>
+                      <a:fillRect/>
+                    </a:stretch>
+                  </pic:blipFill>
+                  <pic:spPr>
+                    <a:xfrm>
+                      <a:off x="0" y="0"/>
+                      <a:ext cx="5906324" cy="2705478"/>
+                    </a:xfrm>
+                    <a:prstGeom prst="rect">
+                      <a:avLst/>
+                    </a:prstGeom>
+                  </pic:spPr>
+                </pic:pic>
+              </a:graphicData>
+            </a:graphic>
+          </wp:inline>
+        </w:drawing>
+      </w:r>
+    </w:p>
+    <w:p>
+      <w:pPr>
+        <w:spacing w:line="480" w:lineRule="auto"/>
+        <w:rPr>
+          <w:rFonts w:ascii="Times New Roman" w:hAnsi="Times New Roman" w:cs="Times New Roman"/>
+          <w:b/>
+          <w:bCs/>
+        </w:rPr>
+      </w:pPr>
+      <w:r>
+        <w:rPr>
+          <w:rFonts w:ascii="Times New Roman" w:hAnsi="Times New Roman" w:cs="Times New Roman"/>
+          <w:b/>
+          <w:bCs/>
+          <w:noProof/>
+        </w:rPr>
+        <w:drawing>
+          <wp:inline distT="0" distB="0" distL="0" distR="0" wp14:anchorId="3975F784" wp14:editId="145C2F0E">
+            <wp:extent cx="5943600" cy="892175"/>
+            <wp:effectExtent l="0" t="0" r="0" b="3175"/>
+            <wp:docPr id="1429049844" name="Picture 1"/>
+            <wp:cNvGraphicFramePr>
+              <a:graphicFrameLocks xmlns:a="http://schemas.openxmlformats.org/drawingml/2006/main" noChangeAspect="1"/>
+            </wp:cNvGraphicFramePr>
+            <a:graphic xmlns:a="http://schemas.openxmlformats.org/drawingml/2006/main">
+              <a:graphicData uri="http://schemas.openxmlformats.org/drawingml/2006/picture">
+                <pic:pic xmlns:pic="http://schemas.openxmlformats.org/drawingml/2006/picture">
+                  <pic:nvPicPr>
+                    <pic:cNvPr id="1429049844" name=""/>
+                    <pic:cNvPicPr/>
+                  </pic:nvPicPr>
+                  <pic:blipFill>
+                    <a:blip r:embed="rId18"/>
+                    <a:stretch>
+                      <a:fillRect/>
+                    </a:stretch>
+                  </pic:blipFill>
+                  <pic:spPr>
+                    <a:xfrm>
+                      <a:off x="0" y="0"/>
+                      <a:ext cx="5943600" cy="892175"/>
+                    </a:xfrm>
+                    <a:prstGeom prst="rect">
+                      <a:avLst/>
+                    </a:prstGeom>
+                  </pic:spPr>
+                </pic:pic>
+              </a:graphicData>
+            </a:graphic>
+          </wp:inline>
+        </w:drawing>
+      </w:r>
+    </w:p>
+    <w:p>
+      <w:pPr>
+        <w:spacing w:line="480" w:lineRule="auto"/>
+        <w:rPr>
+          <w:rFonts w:ascii="Times New Roman" w:hAnsi="Times New Roman" w:cs="Times New Roman"/>
+        </w:rPr>
+      </w:pPr>
+      <w:r>
+        <w:rPr>
+          <w:rFonts w:ascii="Times New Roman" w:hAnsi="Times New Roman" w:cs="Times New Roman"/>
+        </w:rPr>
+        <w:lastRenderedPageBreak/>
+        <w:t xml:space="preserve">This query does show that when games are rated higher by critics they tend to do better in sales. This makes sense, better games get rated higher, and better games are more popular, so they sell more. </w:t>
+      </w:r>
+    </w:p>
+    <w:p>
+      <w:pPr>
+        <w:spacing w:line="480" w:lineRule="auto"/>
+        <w:rPr>
+          <w:rFonts w:ascii="Times New Roman" w:hAnsi="Times New Roman" w:cs="Times New Roman"/>
+        </w:rPr>
+      </w:pPr>
+    </w:p>
+    <w:p>
+      <w:pPr>
+        <w:spacing w:line="480" w:lineRule="auto"/>
+        <w:rPr>
+          <w:rFonts w:ascii="Times New Roman" w:hAnsi="Times New Roman" w:cs="Times New Roman"/>
+        </w:rPr>
+      </w:pPr>
+      <w:r>
+        <w:rPr>
+          <w:rFonts w:ascii="Times New Roman" w:hAnsi="Times New Roman" w:cs="Times New Roman"/>
+        </w:rPr>
+        <w:t>Query 6, What are some “critic-proof” games</w:t>
+      </w:r>
+      <w:r>
+        <w:rPr>
+          <w:rFonts w:ascii="Times New Roman" w:hAnsi="Times New Roman" w:cs="Times New Roman"/>
+        </w:rPr>
+        <w:t>:</w:t>
+      </w:r>
+    </w:p>
+    <w:p>
+      <w:pPr>
+        <w:spacing w:line="480" w:lineRule="auto"/>
+        <w:rPr>
+          <w:rFonts w:ascii="Times New Roman" w:hAnsi="Times New Roman" w:cs="Times New Roman"/>
+          <w:b/>
+          <w:bCs/>
+        </w:rPr>
+      </w:pPr>
+      <w:r>
+        <w:rPr>
+          <w:rFonts w:ascii="Times New Roman" w:hAnsi="Times New Roman" w:cs="Times New Roman"/>
+          <w:b/>
+          <w:bCs/>
+          <w:noProof/>
+        </w:rPr>
+        <w:drawing>
+          <wp:inline distT="0" distB="0" distL="0" distR="0" wp14:anchorId="4F2B56B7" wp14:editId="3E41C527">
+            <wp:extent cx="5379124" cy="3497580"/>
+            <wp:effectExtent l="0" t="0" r="0" b="7620"/>
+            <wp:docPr id="50233903" name="Picture 1"/>
+            <wp:cNvGraphicFramePr>
+              <a:graphicFrameLocks xmlns:a="http://schemas.openxmlformats.org/drawingml/2006/main" noChangeAspect="1"/>
+            </wp:cNvGraphicFramePr>
+            <a:graphic xmlns:a="http://schemas.openxmlformats.org/drawingml/2006/main">
+              <a:graphicData uri="http://schemas.openxmlformats.org/drawingml/2006/picture">
+                <pic:pic xmlns:pic="http://schemas.openxmlformats.org/drawingml/2006/picture">
+                  <pic:nvPicPr>
+                    <pic:cNvPr id="50233903" name=""/>
+                    <pic:cNvPicPr/>
+                  </pic:nvPicPr>
+                  <pic:blipFill>
+                    <a:blip r:embed="rId19"/>
+                    <a:stretch>
+                      <a:fillRect/>
+                    </a:stretch>
+                  </pic:blipFill>
+                  <pic:spPr>
+                    <a:xfrm>
+                      <a:off x="0" y="0"/>
+                      <a:ext cx="5381995" cy="3499447"/>
+                    </a:xfrm>
+                    <a:prstGeom prst="rect">
+                      <a:avLst/>
+                    </a:prstGeom>
+                  </pic:spPr>
+                </pic:pic>
+              </a:graphicData>
+            </a:graphic>
+          </wp:inline>
+        </w:drawing>
+      </w:r>
+    </w:p>
+    <w:p>
+      <w:pPr>
+        <w:spacing w:line="480" w:lineRule="auto"/>
+        <w:rPr>
+          <w:rFonts w:ascii="Times New Roman" w:hAnsi="Times New Roman" w:cs="Times New Roman"/>
+          <w:b/>
+          <w:bCs/>
+        </w:rPr>
+      </w:pPr>
+      <w:r>
+        <w:rPr>
+          <w:rFonts w:ascii="Times New Roman" w:hAnsi="Times New Roman" w:cs="Times New Roman"/>
+          <w:b/>
+          <w:bCs/>
+          <w:noProof/>
+        </w:rPr>
+        <w:drawing>
+          <wp:inline distT="0" distB="0" distL="0" distR="0" wp14:anchorId="210E8FF1" wp14:editId="2026E997">
+            <wp:extent cx="5943600" cy="2252345"/>
+            <wp:effectExtent l="0" t="0" r="0" b="0"/>
+            <wp:docPr id="962130709" name="Picture 1"/>
+            <wp:cNvGraphicFramePr>
+              <a:graphicFrameLocks xmlns:a="http://schemas.openxmlformats.org/drawingml/2006/main" noChangeAspect="1"/>
+            </wp:cNvGraphicFramePr>
+            <a:graphic xmlns:a="http://schemas.openxmlformats.org/drawingml/2006/main">
+              <a:graphicData uri="http://schemas.openxmlformats.org/drawingml/2006/picture">
+                <pic:pic xmlns:pic="http://schemas.openxmlformats.org/drawingml/2006/picture">
+                  <pic:nvPicPr>
+                    <pic:cNvPr id="962130709" name=""/>
+                    <pic:cNvPicPr/>
+                  </pic:nvPicPr>
+                  <pic:blipFill>
+                    <a:blip r:embed="rId20"/>
+                    <a:stretch>
+                      <a:fillRect/>
+                    </a:stretch>
+                  </pic:blipFill>
+                  <pic:spPr>
+                    <a:xfrm>
+                      <a:off x="0" y="0"/>
+                      <a:ext cx="5943600" cy="2252345"/>
+                    </a:xfrm>
+                    <a:prstGeom prst="rect">
+                      <a:avLst/>
+                    </a:prstGeom>
+                  </pic:spPr>
+                </pic:pic>
+              </a:graphicData>
+            </a:graphic>
+          </wp:inline>
+        </w:drawing>
+      </w:r>
+    </w:p>
+    <w:p>
+      <w:pPr>
+        <w:spacing w:line="480" w:lineRule="auto"/>
+        <w:rPr>
+          <w:rFonts w:ascii="Times New Roman" w:hAnsi="Times New Roman" w:cs="Times New Roman"/>
+        </w:rPr>
+      </w:pPr>
+      <w:r>
+        <w:rPr>
+          <w:rFonts w:ascii="Times New Roman" w:hAnsi="Times New Roman" w:cs="Times New Roman"/>
+        </w:rPr>
+        <w:lastRenderedPageBreak/>
+        <w:t xml:space="preserve">This query shows games that had low scores </w:t>
+      </w:r>
+      <w:r>
+        <w:rPr>
+          <w:rFonts w:ascii="Times New Roman" w:hAnsi="Times New Roman" w:cs="Times New Roman"/>
+        </w:rPr>
+        <w:t xml:space="preserve">by critics, but still sold really well. This can be seen as the critics got it wrong, or games that have a cult following. An example of the cult following could be the Cooking Mama series, and an example of the critics got it wrong could be the Call of Duty Ghosts. </w:t>
+      </w:r>
+    </w:p>
+    <w:p>
+      <w:pPr>
+        <w:spacing w:line="480" w:lineRule="auto"/>
+        <w:rPr>
+          <w:rFonts w:ascii="Times New Roman" w:hAnsi="Times New Roman" w:cs="Times New Roman"/>
+        </w:rPr>
+      </w:pPr>
+    </w:p>
+    <w:p>
+      <w:pPr>
+        <w:spacing w:line="480" w:lineRule="auto"/>
+        <w:rPr>
+          <w:rFonts w:ascii="Times New Roman" w:hAnsi="Times New Roman" w:cs="Times New Roman"/>
+        </w:rPr>
+      </w:pPr>
+      <w:r>
+        <w:rPr>
+          <w:rFonts w:ascii="Times New Roman" w:hAnsi="Times New Roman" w:cs="Times New Roman"/>
+        </w:rPr>
+        <w:br w:type="page"/>
+      </w:r>
+    </w:p>
+    <w:p>
+      <w:pPr>
+        <w:spacing w:line="480" w:lineRule="auto"/>
+        <w:jc w:val="center"/>
+        <w:rPr>
+          <w:rFonts w:ascii="Times New Roman" w:hAnsi="Times New Roman" w:cs="Times New Roman"/>
+          <w:b/>
+          <w:bCs/>
+        </w:rPr>
+      </w:pPr>
+      <w:r>
+        <w:rPr>
+          <w:rFonts w:ascii="Times New Roman" w:hAnsi="Times New Roman" w:cs="Times New Roman"/>
+          <w:b/>
+          <w:bCs/>
+        </w:rPr>
+        <w:lastRenderedPageBreak/>
+        <w:t>R</w:t>
+      </w:r>
+      <w:r>
+        <w:rPr>
+          <w:rFonts w:ascii="Times New Roman" w:hAnsi="Times New Roman" w:cs="Times New Roman"/>
+          <w:b/>
+          <w:bCs/>
+        </w:rPr>
+        <w:t>eporting,</w:t>
+      </w:r>
+      <w:r>
+        <w:rPr>
+          <w:rFonts w:ascii="Times New Roman" w:hAnsi="Times New Roman" w:cs="Times New Roman"/>
+          <w:b/>
+          <w:bCs/>
+        </w:rPr>
+        <w:t xml:space="preserve"> M</w:t>
+      </w:r>
+      <w:r>
+        <w:rPr>
+          <w:rFonts w:ascii="Times New Roman" w:hAnsi="Times New Roman" w:cs="Times New Roman"/>
+          <w:b/>
+          <w:bCs/>
+        </w:rPr>
+        <w:t xml:space="preserve">odeling, </w:t>
+      </w:r>
+      <w:r>
+        <w:rPr>
+          <w:rFonts w:ascii="Times New Roman" w:hAnsi="Times New Roman" w:cs="Times New Roman"/>
+          <w:b/>
+          <w:bCs/>
+        </w:rPr>
+        <w:t>S</w:t>
+      </w:r>
+      <w:r>
+        <w:rPr>
+          <w:rFonts w:ascii="Times New Roman" w:hAnsi="Times New Roman" w:cs="Times New Roman"/>
+          <w:b/>
+          <w:bCs/>
+        </w:rPr>
+        <w:t>torytelling</w:t>
+      </w:r>
+    </w:p>
+    <w:p>
+      <w:pPr>
+        <w:spacing w:line="480" w:lineRule="auto"/>
+        <w:rPr>
+          <w:rFonts w:ascii="Times New Roman" w:hAnsi="Times New Roman" w:cs="Times New Roman"/>
+        </w:rPr>
+      </w:pPr>
+      <w:r>
+        <w:rPr>
+          <w:rFonts w:ascii="Times New Roman" w:hAnsi="Times New Roman" w:cs="Times New Roman"/>
+        </w:rPr>
+        <w:t>Here I will go through the visualizations</w:t>
+      </w:r>
+      <w:r>
+        <w:rPr>
+          <w:rFonts w:ascii="Times New Roman" w:hAnsi="Times New Roman" w:cs="Times New Roman"/>
+        </w:rPr>
+        <w:t>, again these are split into the 3 topics mentioned earlier.</w:t>
+      </w:r>
+      <w:r>
+        <w:rPr>
+          <w:rFonts w:ascii="Times New Roman" w:hAnsi="Times New Roman" w:cs="Times New Roman"/>
+        </w:rPr>
+        <w:t xml:space="preserve"> I created these visualizations using </w:t>
+      </w:r>
+      <w:r>
+        <w:rPr>
+          <w:rFonts w:ascii="Times New Roman" w:hAnsi="Times New Roman" w:cs="Times New Roman"/>
+        </w:rPr>
+        <w:t xml:space="preserve">a python script that used matplotlib and pandas. The script can be seen in the project’s </w:t>
+      </w:r>
+      <w:hyperlink r:id="rId21" w:history="1">
+        <w:r>
+          <w:rPr>
+            <w:rStyle w:val="Hyperlink"/>
+            <w:rFonts w:ascii="Times New Roman" w:hAnsi="Times New Roman" w:cs="Times New Roman"/>
+          </w:rPr>
+          <w:t>GitHub Repository</w:t>
+        </w:r>
+      </w:hyperlink>
+      <w:r>
+        <w:rPr>
+          <w:rFonts w:ascii="Times New Roman" w:hAnsi="Times New Roman" w:cs="Times New Roman"/>
+        </w:rPr>
+        <w:t>.</w:t>
+      </w:r>
+      <w:r>
+        <w:rPr>
+          <w:rFonts w:ascii="Times New Roman" w:hAnsi="Times New Roman" w:cs="Times New Roman"/>
+        </w:rPr>
+        <w:t xml:space="preserve"> Note that each chart corresponds to the numbered query above</w:t>
+      </w:r>
+    </w:p>
+    <w:p>
+      <w:pPr>
+        <w:spacing w:line="480" w:lineRule="auto"/>
+        <w:rPr>
+          <w:rFonts w:ascii="Times New Roman" w:hAnsi="Times New Roman" w:cs="Times New Roman"/>
+          <w:b/>
+          <w:bCs/>
+        </w:rPr>
+      </w:pPr>
+      <w:r>
+        <w:rPr>
+          <w:rFonts w:ascii="Times New Roman" w:hAnsi="Times New Roman" w:cs="Times New Roman"/>
+          <w:b/>
+          <w:bCs/>
+        </w:rPr>
+        <w:t xml:space="preserve">Topic 1, </w:t>
+      </w:r>
+      <w:r>
+        <w:rPr>
+          <w:rFonts w:ascii="Times New Roman" w:hAnsi="Times New Roman" w:cs="Times New Roman"/>
+          <w:b/>
+          <w:bCs/>
+        </w:rPr>
+        <w:t>Game Trends Over Time</w:t>
+      </w:r>
+      <w:r>
+        <w:rPr>
+          <w:rFonts w:ascii="Times New Roman" w:hAnsi="Times New Roman" w:cs="Times New Roman"/>
+          <w:b/>
+          <w:bCs/>
+        </w:rPr>
+        <w:t>:</w:t>
+      </w:r>
+    </w:p>
+    <w:p>
+      <w:pPr>
+        <w:spacing w:line="480" w:lineRule="auto"/>
+        <w:rPr>
+          <w:rFonts w:ascii="Times New Roman" w:hAnsi="Times New Roman" w:cs="Times New Roman"/>
+        </w:rPr>
+      </w:pPr>
+      <w:r>
+        <w:rPr>
+          <w:rFonts w:ascii="Times New Roman" w:hAnsi="Times New Roman" w:cs="Times New Roman"/>
+        </w:rPr>
+        <w:t xml:space="preserve">Chart 1, </w:t>
+      </w:r>
+      <w:r>
+        <w:rPr>
+          <w:rFonts w:ascii="Times New Roman" w:hAnsi="Times New Roman" w:cs="Times New Roman"/>
+        </w:rPr>
+        <w:t>Top genre per era:</w:t>
+      </w:r>
+    </w:p>
+    <w:p>
+      <w:pPr>
+        <w:spacing w:line="480" w:lineRule="auto"/>
+        <w:rPr>
+          <w:rFonts w:ascii="Times New Roman" w:hAnsi="Times New Roman" w:cs="Times New Roman"/>
+          <w:b/>
+          <w:bCs/>
+        </w:rPr>
+      </w:pPr>
+      <w:r>
+        <w:rPr>
+          <w:rFonts w:ascii="Times New Roman" w:hAnsi="Times New Roman" w:cs="Times New Roman"/>
+          <w:b/>
+          <w:bCs/>
+          <w:noProof/>
+        </w:rPr>
+        <w:drawing>
+          <wp:inline distT="0" distB="0" distL="0" distR="0" wp14:anchorId="04EEC836" wp14:editId="0B621F4D">
+            <wp:extent cx="4988129" cy="2404534"/>
+            <wp:effectExtent l="0" t="0" r="3175" b="0"/>
+            <wp:docPr id="1066940618" name="Picture 1"/>
+            <wp:cNvGraphicFramePr>
+              <a:graphicFrameLocks xmlns:a="http://schemas.openxmlformats.org/drawingml/2006/main" noChangeAspect="1"/>
+            </wp:cNvGraphicFramePr>
+            <a:graphic xmlns:a="http://schemas.openxmlformats.org/drawingml/2006/main">
+              <a:graphicData uri="http://schemas.openxmlformats.org/drawingml/2006/picture">
+                <pic:pic xmlns:pic="http://schemas.openxmlformats.org/drawingml/2006/picture">
+                  <pic:nvPicPr>
+                    <pic:cNvPr id="1066940618" name="Picture 1066940618"/>
+                    <pic:cNvPicPr/>
+                  </pic:nvPicPr>
+                  <pic:blipFill>
+                    <a:blip r:embed="rId22" cstate="print">
+                      <a:extLst>
+                        <a:ext uri="{28A0092B-C50C-407E-A947-70E740481C1C}">
+                          <a14:useLocalDpi xmlns:a14="http://schemas.microsoft.com/office/drawing/2010/main" val="0"/>
+                        </a:ext>
+                      </a:extLst>
+                    </a:blip>
+                    <a:stretch>
+                      <a:fillRect/>
+                    </a:stretch>
+                  </pic:blipFill>
+                  <pic:spPr>
+                    <a:xfrm>
+                      <a:off x="0" y="0"/>
+                      <a:ext cx="4997879" cy="2409234"/>
+                    </a:xfrm>
+                    <a:prstGeom prst="rect">
+                      <a:avLst/>
+                    </a:prstGeom>
+                  </pic:spPr>
+                </pic:pic>
+              </a:graphicData>
+            </a:graphic>
+          </wp:inline>
+        </w:drawing>
+      </w:r>
+    </w:p>
+    <w:p>
+      <w:pPr>
+        <w:spacing w:line="480" w:lineRule="auto"/>
+        <w:rPr>
+          <w:rFonts w:ascii="Times New Roman" w:hAnsi="Times New Roman" w:cs="Times New Roman"/>
+        </w:rPr>
+      </w:pPr>
+      <w:r>
+        <w:rPr>
+          <w:rFonts w:ascii="Times New Roman" w:hAnsi="Times New Roman" w:cs="Times New Roman"/>
+        </w:rPr>
+        <w:t xml:space="preserve">In this chart for </w:t>
+      </w:r>
+      <w:r>
+        <w:rPr>
+          <w:rFonts w:ascii="Times New Roman" w:hAnsi="Times New Roman" w:cs="Times New Roman"/>
+        </w:rPr>
+        <w:t>simplicity,</w:t>
+      </w:r>
+      <w:r>
+        <w:rPr>
+          <w:rFonts w:ascii="Times New Roman" w:hAnsi="Times New Roman" w:cs="Times New Roman"/>
+        </w:rPr>
+        <w:t xml:space="preserve"> I only did the top genre per era. This visually shows the boom of sports games in rise of 3D models in gaming, especially in the PlayStation 1 and 2 eras. It also shows the maturing of the industry with the rise of action games in the 7</w:t>
+      </w:r>
+      <w:r>
+        <w:rPr>
+          <w:rFonts w:ascii="Times New Roman" w:hAnsi="Times New Roman" w:cs="Times New Roman"/>
+          <w:vertAlign w:val="superscript"/>
+        </w:rPr>
+        <w:t>th</w:t>
+      </w:r>
+      <w:r>
+        <w:rPr>
+          <w:rFonts w:ascii="Times New Roman" w:hAnsi="Times New Roman" w:cs="Times New Roman"/>
+        </w:rPr>
+        <w:t xml:space="preserve"> generation and the revival of shooter games in the 8</w:t>
+      </w:r>
+      <w:r>
+        <w:rPr>
+          <w:rFonts w:ascii="Times New Roman" w:hAnsi="Times New Roman" w:cs="Times New Roman"/>
+          <w:vertAlign w:val="superscript"/>
+        </w:rPr>
+        <w:t>th</w:t>
+      </w:r>
+      <w:r>
+        <w:rPr>
+          <w:rFonts w:ascii="Times New Roman" w:hAnsi="Times New Roman" w:cs="Times New Roman"/>
+        </w:rPr>
+        <w:t xml:space="preserve"> generation. </w:t>
+      </w:r>
+    </w:p>
+    <w:p>
+      <w:pPr>
+        <w:spacing w:line="480" w:lineRule="auto"/>
+        <w:rPr>
+          <w:rFonts w:ascii="Times New Roman" w:hAnsi="Times New Roman" w:cs="Times New Roman"/>
+          <w:b/>
+          <w:bCs/>
+        </w:rPr>
+      </w:pPr>
+    </w:p>
+    <w:p>
+      <w:pPr>
+        <w:spacing w:line="480" w:lineRule="auto"/>
+        <w:rPr>
+          <w:rFonts w:ascii="Times New Roman" w:hAnsi="Times New Roman" w:cs="Times New Roman"/>
+          <w:b/>
+          <w:bCs/>
+        </w:rPr>
+      </w:pPr>
+    </w:p>
+    <w:p>
+      <w:pPr>
+        <w:spacing w:line="480" w:lineRule="auto"/>
+        <w:rPr>
+          <w:rFonts w:ascii="Times New Roman" w:hAnsi="Times New Roman" w:cs="Times New Roman"/>
+          <w:b/>
+          <w:bCs/>
+        </w:rPr>
+      </w:pPr>
+    </w:p>
+    <w:p>
+      <w:pPr>
+        <w:spacing w:line="480" w:lineRule="auto"/>
+        <w:rPr>
+          <w:rFonts w:ascii="Times New Roman" w:hAnsi="Times New Roman" w:cs="Times New Roman"/>
+        </w:rPr>
+      </w:pPr>
+      <w:r>
+        <w:rPr>
+          <w:rFonts w:ascii="Times New Roman" w:hAnsi="Times New Roman" w:cs="Times New Roman"/>
+        </w:rPr>
+        <w:lastRenderedPageBreak/>
+        <w:t xml:space="preserve">Chart 2, </w:t>
+      </w:r>
+      <w:r>
+        <w:rPr>
+          <w:rFonts w:ascii="Times New Roman" w:hAnsi="Times New Roman" w:cs="Times New Roman"/>
+        </w:rPr>
+        <w:t>fastest growing genres between the 2000s and the 2010s</w:t>
+      </w:r>
+      <w:r>
+        <w:rPr>
+          <w:rFonts w:ascii="Times New Roman" w:hAnsi="Times New Roman" w:cs="Times New Roman"/>
+        </w:rPr>
+        <w:t>:</w:t>
+      </w:r>
+    </w:p>
+    <w:p>
+      <w:pPr>
+        <w:spacing w:line="480" w:lineRule="auto"/>
+        <w:rPr>
+          <w:rFonts w:ascii="Times New Roman" w:hAnsi="Times New Roman" w:cs="Times New Roman"/>
+          <w:b/>
+          <w:bCs/>
+        </w:rPr>
+      </w:pPr>
+      <w:r>
+        <w:rPr>
+          <w:rFonts w:ascii="Times New Roman" w:hAnsi="Times New Roman" w:cs="Times New Roman"/>
+          <w:b/>
+          <w:bCs/>
+          <w:noProof/>
+        </w:rPr>
+        <w:drawing>
+          <wp:inline distT="0" distB="0" distL="0" distR="0" wp14:anchorId="62F4149F" wp14:editId="3C906AE8">
+            <wp:extent cx="4922237" cy="3132667"/>
+            <wp:effectExtent l="0" t="0" r="0" b="0"/>
+            <wp:docPr id="1866493868" name="Picture 2"/>
+            <wp:cNvGraphicFramePr>
+              <a:graphicFrameLocks xmlns:a="http://schemas.openxmlformats.org/drawingml/2006/main" noChangeAspect="1"/>
+            </wp:cNvGraphicFramePr>
+            <a:graphic xmlns:a="http://schemas.openxmlformats.org/drawingml/2006/main">
+              <a:graphicData uri="http://schemas.openxmlformats.org/drawingml/2006/picture">
+                <pic:pic xmlns:pic="http://schemas.openxmlformats.org/drawingml/2006/picture">
+                  <pic:nvPicPr>
+                    <pic:cNvPr id="1866493868" name="Picture 1866493868"/>
+                    <pic:cNvPicPr/>
+                  </pic:nvPicPr>
+                  <pic:blipFill>
+                    <a:blip r:embed="rId23" cstate="print">
+                      <a:extLst>
+                        <a:ext uri="{28A0092B-C50C-407E-A947-70E740481C1C}">
+                          <a14:useLocalDpi xmlns:a14="http://schemas.microsoft.com/office/drawing/2010/main" val="0"/>
+                        </a:ext>
+                      </a:extLst>
+                    </a:blip>
+                    <a:stretch>
+                      <a:fillRect/>
+                    </a:stretch>
+                  </pic:blipFill>
+                  <pic:spPr>
+                    <a:xfrm>
+                      <a:off x="0" y="0"/>
+                      <a:ext cx="4931104" cy="3138310"/>
+                    </a:xfrm>
+                    <a:prstGeom prst="rect">
+                      <a:avLst/>
+                    </a:prstGeom>
+                  </pic:spPr>
+                </pic:pic>
+              </a:graphicData>
+            </a:graphic>
+          </wp:inline>
+        </w:drawing>
+      </w:r>
+    </w:p>
+    <w:p>
+      <w:pPr>
+        <w:spacing w:line="480" w:lineRule="auto"/>
+        <w:rPr>
+          <w:rFonts w:ascii="Times New Roman" w:hAnsi="Times New Roman" w:cs="Times New Roman"/>
+        </w:rPr>
+      </w:pPr>
+      <w:r>
+        <w:rPr>
+          <w:rFonts w:ascii="Times New Roman" w:hAnsi="Times New Roman" w:cs="Times New Roman"/>
+        </w:rPr>
+        <w:t xml:space="preserve">This chart shows the massive boom of the Action-Adventure genre that we talked about earlier, but in a visual </w:t>
+      </w:r>
+      <w:r>
+        <w:rPr>
+          <w:rFonts w:ascii="Times New Roman" w:hAnsi="Times New Roman" w:cs="Times New Roman"/>
+        </w:rPr>
+        <w:t>perspective</w:t>
+      </w:r>
+      <w:r>
+        <w:rPr>
+          <w:rFonts w:ascii="Times New Roman" w:hAnsi="Times New Roman" w:cs="Times New Roman"/>
+        </w:rPr>
+        <w:t xml:space="preserve"> shows how much larger the boom is compared to the other genres, that also grew significantly. </w:t>
+      </w:r>
+    </w:p>
+    <w:p>
+      <w:pPr>
+        <w:spacing w:line="480" w:lineRule="auto"/>
+        <w:rPr>
+          <w:rFonts w:ascii="Times New Roman" w:hAnsi="Times New Roman" w:cs="Times New Roman"/>
+          <w:b/>
+          <w:bCs/>
+        </w:rPr>
+      </w:pPr>
+    </w:p>
+    <w:p>
+      <w:pPr>
+        <w:spacing w:line="480" w:lineRule="auto"/>
+        <w:rPr>
+          <w:rFonts w:ascii="Times New Roman" w:hAnsi="Times New Roman" w:cs="Times New Roman"/>
+          <w:b/>
+          <w:bCs/>
+        </w:rPr>
+      </w:pPr>
+    </w:p>
+    <w:p>
+      <w:pPr>
+        <w:spacing w:line="480" w:lineRule="auto"/>
+        <w:rPr>
+          <w:rFonts w:ascii="Times New Roman" w:hAnsi="Times New Roman" w:cs="Times New Roman"/>
+          <w:b/>
+          <w:bCs/>
+        </w:rPr>
+      </w:pPr>
+    </w:p>
+    <w:p>
+      <w:pPr>
+        <w:spacing w:line="480" w:lineRule="auto"/>
+        <w:rPr>
+          <w:rFonts w:ascii="Times New Roman" w:hAnsi="Times New Roman" w:cs="Times New Roman"/>
+          <w:b/>
+          <w:bCs/>
+        </w:rPr>
+      </w:pPr>
+    </w:p>
+    <w:p>
+      <w:pPr>
+        <w:spacing w:line="480" w:lineRule="auto"/>
+        <w:rPr>
+          <w:rFonts w:ascii="Times New Roman" w:hAnsi="Times New Roman" w:cs="Times New Roman"/>
+          <w:b/>
+          <w:bCs/>
+        </w:rPr>
+      </w:pPr>
+    </w:p>
+    <w:p>
+      <w:pPr>
+        <w:spacing w:line="480" w:lineRule="auto"/>
+        <w:rPr>
+          <w:rFonts w:ascii="Times New Roman" w:hAnsi="Times New Roman" w:cs="Times New Roman"/>
+          <w:b/>
+          <w:bCs/>
+        </w:rPr>
+      </w:pPr>
+    </w:p>
+    <w:p>
+      <w:pPr>
+        <w:spacing w:line="480" w:lineRule="auto"/>
+        <w:rPr>
+          <w:rFonts w:ascii="Times New Roman" w:hAnsi="Times New Roman" w:cs="Times New Roman"/>
+          <w:b/>
+          <w:bCs/>
+        </w:rPr>
+      </w:pPr>
+    </w:p>
+    <w:p>
+      <w:pPr>
+        <w:spacing w:line="480" w:lineRule="auto"/>
+        <w:rPr>
+          <w:rFonts w:ascii="Times New Roman" w:hAnsi="Times New Roman" w:cs="Times New Roman"/>
+          <w:b/>
+          <w:bCs/>
+        </w:rPr>
+      </w:pPr>
+      <w:r>
+        <w:rPr>
+          <w:rFonts w:ascii="Times New Roman" w:hAnsi="Times New Roman" w:cs="Times New Roman"/>
+          <w:b/>
+          <w:bCs/>
+        </w:rPr>
+        <w:lastRenderedPageBreak/>
+        <w:t>Topic 2, Differences Between Platforms:</w:t>
+      </w:r>
+    </w:p>
+    <w:p>
+      <w:pPr>
+        <w:spacing w:line="480" w:lineRule="auto"/>
+        <w:rPr>
+          <w:rFonts w:ascii="Times New Roman" w:hAnsi="Times New Roman" w:cs="Times New Roman"/>
+        </w:rPr>
+      </w:pPr>
+      <w:r>
+        <w:rPr>
+          <w:rFonts w:ascii="Times New Roman" w:hAnsi="Times New Roman" w:cs="Times New Roman"/>
+        </w:rPr>
+        <w:t>Chart</w:t>
+      </w:r>
+      <w:r>
+        <w:rPr>
+          <w:rFonts w:ascii="Times New Roman" w:hAnsi="Times New Roman" w:cs="Times New Roman"/>
+        </w:rPr>
+        <w:t xml:space="preserve"> 3, </w:t>
+      </w:r>
+      <w:r>
+        <w:rPr>
+          <w:rFonts w:ascii="Times New Roman" w:hAnsi="Times New Roman" w:cs="Times New Roman"/>
+        </w:rPr>
+        <w:t>the big 3 companies ranked in terms of sales:</w:t>
+      </w:r>
+    </w:p>
+    <w:p>
+      <w:pPr>
+        <w:spacing w:line="480" w:lineRule="auto"/>
+        <w:rPr>
+          <w:rFonts w:ascii="Times New Roman" w:hAnsi="Times New Roman" w:cs="Times New Roman"/>
+          <w:b/>
+          <w:bCs/>
+        </w:rPr>
+      </w:pPr>
+      <w:r>
+        <w:rPr>
+          <w:rFonts w:ascii="Times New Roman" w:hAnsi="Times New Roman" w:cs="Times New Roman"/>
+          <w:b/>
+          <w:bCs/>
+          <w:noProof/>
+        </w:rPr>
+        <w:drawing>
+          <wp:inline distT="0" distB="0" distL="0" distR="0" wp14:anchorId="64962183" wp14:editId="2024BDC1">
+            <wp:extent cx="5410200" cy="2569844"/>
+            <wp:effectExtent l="0" t="0" r="0" b="2540"/>
+            <wp:docPr id="2125759670" name="Picture 3"/>
+            <wp:cNvGraphicFramePr>
+              <a:graphicFrameLocks xmlns:a="http://schemas.openxmlformats.org/drawingml/2006/main" noChangeAspect="1"/>
+            </wp:cNvGraphicFramePr>
+            <a:graphic xmlns:a="http://schemas.openxmlformats.org/drawingml/2006/main">
+              <a:graphicData uri="http://schemas.openxmlformats.org/drawingml/2006/picture">
+                <pic:pic xmlns:pic="http://schemas.openxmlformats.org/drawingml/2006/picture">
+                  <pic:nvPicPr>
+                    <pic:cNvPr id="2125759670" name="Picture 2125759670"/>
+                    <pic:cNvPicPr/>
+                  </pic:nvPicPr>
+                  <pic:blipFill>
+                    <a:blip r:embed="rId24" cstate="print">
+                      <a:extLst>
+                        <a:ext uri="{28A0092B-C50C-407E-A947-70E740481C1C}">
+                          <a14:useLocalDpi xmlns:a14="http://schemas.microsoft.com/office/drawing/2010/main" val="0"/>
+                        </a:ext>
+                      </a:extLst>
+                    </a:blip>
+                    <a:stretch>
+                      <a:fillRect/>
+                    </a:stretch>
+                  </pic:blipFill>
+                  <pic:spPr>
+                    <a:xfrm>
+                      <a:off x="0" y="0"/>
+                      <a:ext cx="5467599" cy="2597109"/>
+                    </a:xfrm>
+                    <a:prstGeom prst="rect">
+                      <a:avLst/>
+                    </a:prstGeom>
+                  </pic:spPr>
+                </pic:pic>
+              </a:graphicData>
+            </a:graphic>
+          </wp:inline>
+        </w:drawing>
+      </w:r>
+    </w:p>
+    <w:p>
+      <w:pPr>
+        <w:spacing w:line="480" w:lineRule="auto"/>
+        <w:rPr>
+          <w:rFonts w:ascii="Times New Roman" w:hAnsi="Times New Roman" w:cs="Times New Roman"/>
+        </w:rPr>
+      </w:pPr>
+      <w:r>
+        <w:rPr>
+          <w:rFonts w:ascii="Times New Roman" w:hAnsi="Times New Roman" w:cs="Times New Roman"/>
+        </w:rPr>
+        <w:t xml:space="preserve">This visually shows how much more Sony has in terms of sales compared to the other 2 companies, however it shows how Microsoft is not far off from Sony and actually leads in sales per title. </w:t>
+      </w:r>
+    </w:p>
+    <w:p>
+      <w:pPr>
+        <w:spacing w:line="480" w:lineRule="auto"/>
+        <w:rPr>
+          <w:rFonts w:ascii="Times New Roman" w:hAnsi="Times New Roman" w:cs="Times New Roman"/>
+        </w:rPr>
+      </w:pPr>
+      <w:r>
+        <w:rPr>
+          <w:rFonts w:ascii="Times New Roman" w:hAnsi="Times New Roman" w:cs="Times New Roman"/>
+        </w:rPr>
+        <w:t xml:space="preserve">Chart 4, </w:t>
+      </w:r>
+      <w:r>
+        <w:rPr>
+          <w:rFonts w:ascii="Times New Roman" w:hAnsi="Times New Roman" w:cs="Times New Roman"/>
+        </w:rPr>
+        <w:t>Ranking each company’s platform into quadrants:</w:t>
+      </w:r>
+    </w:p>
+    <w:p>
+      <w:pPr>
+        <w:spacing w:line="480" w:lineRule="auto"/>
+        <w:rPr>
+          <w:rFonts w:ascii="Times New Roman" w:hAnsi="Times New Roman" w:cs="Times New Roman"/>
+          <w:b/>
+          <w:bCs/>
+        </w:rPr>
+      </w:pPr>
+      <w:r>
+        <w:rPr>
+          <w:rFonts w:ascii="Times New Roman" w:hAnsi="Times New Roman" w:cs="Times New Roman"/>
+          <w:b/>
+          <w:bCs/>
+          <w:noProof/>
+        </w:rPr>
+        <w:drawing>
+          <wp:inline distT="0" distB="0" distL="0" distR="0" wp14:anchorId="5F86D04E" wp14:editId="3C4AE44A">
+            <wp:extent cx="4419600" cy="2752334"/>
+            <wp:effectExtent l="0" t="0" r="0" b="0"/>
+            <wp:docPr id="247341405" name="Picture 4"/>
+            <wp:cNvGraphicFramePr>
+              <a:graphicFrameLocks xmlns:a="http://schemas.openxmlformats.org/drawingml/2006/main" noChangeAspect="1"/>
+            </wp:cNvGraphicFramePr>
+            <a:graphic xmlns:a="http://schemas.openxmlformats.org/drawingml/2006/main">
+              <a:graphicData uri="http://schemas.openxmlformats.org/drawingml/2006/picture">
+                <pic:pic xmlns:pic="http://schemas.openxmlformats.org/drawingml/2006/picture">
+                  <pic:nvPicPr>
+                    <pic:cNvPr id="247341405" name="Picture 247341405"/>
+                    <pic:cNvPicPr/>
+                  </pic:nvPicPr>
+                  <pic:blipFill>
+                    <a:blip r:embed="rId25" cstate="print">
+                      <a:extLst>
+                        <a:ext uri="{28A0092B-C50C-407E-A947-70E740481C1C}">
+                          <a14:useLocalDpi xmlns:a14="http://schemas.microsoft.com/office/drawing/2010/main" val="0"/>
+                        </a:ext>
+                      </a:extLst>
+                    </a:blip>
+                    <a:stretch>
+                      <a:fillRect/>
+                    </a:stretch>
+                  </pic:blipFill>
+                  <pic:spPr>
+                    <a:xfrm>
+                      <a:off x="0" y="0"/>
+                      <a:ext cx="4452311" cy="2772705"/>
+                    </a:xfrm>
+                    <a:prstGeom prst="rect">
+                      <a:avLst/>
+                    </a:prstGeom>
+                  </pic:spPr>
+                </pic:pic>
+              </a:graphicData>
+            </a:graphic>
+          </wp:inline>
+        </w:drawing>
+      </w:r>
+    </w:p>
+    <w:p>
+      <w:pPr>
+        <w:spacing w:line="480" w:lineRule="auto"/>
+        <w:rPr>
+          <w:rFonts w:ascii="Times New Roman" w:hAnsi="Times New Roman" w:cs="Times New Roman"/>
+        </w:rPr>
+      </w:pPr>
+      <w:r>
+        <w:rPr>
+          <w:rFonts w:ascii="Times New Roman" w:hAnsi="Times New Roman" w:cs="Times New Roman"/>
+        </w:rPr>
+        <w:lastRenderedPageBreak/>
+        <w:t xml:space="preserve">This visualization shows the sales of games per platform but also categorizes the quadrants. This Is good to see how Nintendo’s 2 quadrant 4 platforms actually performed worse than one of Sony’s quadrant 2 platforms. It also shows how since Microsoft only has 4 platforms in this dataset, each quadrant has its own platform. </w:t>
+      </w:r>
+    </w:p>
+    <w:p>
+      <w:pPr>
+        <w:spacing w:line="480" w:lineRule="auto"/>
+        <w:rPr>
+          <w:rFonts w:ascii="Times New Roman" w:hAnsi="Times New Roman" w:cs="Times New Roman"/>
+          <w:b/>
+          <w:bCs/>
+        </w:rPr>
+      </w:pPr>
+      <w:r>
+        <w:rPr>
+          <w:rFonts w:ascii="Times New Roman" w:hAnsi="Times New Roman" w:cs="Times New Roman"/>
+          <w:b/>
+          <w:bCs/>
+        </w:rPr>
+        <w:t>Topic 3, Critic Score vs Sales:</w:t>
+      </w:r>
+    </w:p>
+    <w:p>
+      <w:pPr>
+        <w:spacing w:line="480" w:lineRule="auto"/>
+        <w:rPr>
+          <w:rFonts w:ascii="Times New Roman" w:hAnsi="Times New Roman" w:cs="Times New Roman"/>
+        </w:rPr>
+      </w:pPr>
+      <w:r>
+        <w:rPr>
+          <w:rFonts w:ascii="Times New Roman" w:hAnsi="Times New Roman" w:cs="Times New Roman"/>
+        </w:rPr>
+        <w:t xml:space="preserve">Chart 5, </w:t>
+      </w:r>
+      <w:r>
+        <w:rPr>
+          <w:rFonts w:ascii="Times New Roman" w:hAnsi="Times New Roman" w:cs="Times New Roman"/>
+        </w:rPr>
+        <w:t>Do critic scores translate to sales:</w:t>
+      </w:r>
+    </w:p>
+    <w:p>
+      <w:pPr>
+        <w:spacing w:line="480" w:lineRule="auto"/>
+        <w:rPr>
+          <w:rFonts w:ascii="Times New Roman" w:hAnsi="Times New Roman" w:cs="Times New Roman"/>
+          <w:b/>
+          <w:bCs/>
+        </w:rPr>
+      </w:pPr>
+      <w:r>
+        <w:rPr>
+          <w:rFonts w:ascii="Times New Roman" w:hAnsi="Times New Roman" w:cs="Times New Roman"/>
+          <w:b/>
+          <w:bCs/>
+          <w:noProof/>
+        </w:rPr>
+        <w:drawing>
+          <wp:inline distT="0" distB="0" distL="0" distR="0" wp14:anchorId="317ADCE0" wp14:editId="39BEC5DF">
+            <wp:extent cx="5943600" cy="2834005"/>
+            <wp:effectExtent l="0" t="0" r="0" b="4445"/>
+            <wp:docPr id="755409582" name="Picture 5"/>
+            <wp:cNvGraphicFramePr>
+              <a:graphicFrameLocks xmlns:a="http://schemas.openxmlformats.org/drawingml/2006/main" noChangeAspect="1"/>
+            </wp:cNvGraphicFramePr>
+            <a:graphic xmlns:a="http://schemas.openxmlformats.org/drawingml/2006/main">
+              <a:graphicData uri="http://schemas.openxmlformats.org/drawingml/2006/picture">
+                <pic:pic xmlns:pic="http://schemas.openxmlformats.org/drawingml/2006/picture">
+                  <pic:nvPicPr>
+                    <pic:cNvPr id="755409582" name="Picture 755409582"/>
+                    <pic:cNvPicPr/>
+                  </pic:nvPicPr>
+                  <pic:blipFill>
+                    <a:blip r:embed="rId26" cstate="print">
+                      <a:extLst>
+                        <a:ext uri="{28A0092B-C50C-407E-A947-70E740481C1C}">
+                          <a14:useLocalDpi xmlns:a14="http://schemas.microsoft.com/office/drawing/2010/main" val="0"/>
+                        </a:ext>
+                      </a:extLst>
+                    </a:blip>
+                    <a:stretch>
+                      <a:fillRect/>
+                    </a:stretch>
+                  </pic:blipFill>
+                  <pic:spPr>
+                    <a:xfrm>
+                      <a:off x="0" y="0"/>
+                      <a:ext cx="5943600" cy="2834005"/>
+                    </a:xfrm>
+                    <a:prstGeom prst="rect">
+                      <a:avLst/>
+                    </a:prstGeom>
+                  </pic:spPr>
+                </pic:pic>
+              </a:graphicData>
+            </a:graphic>
+          </wp:inline>
+        </w:drawing>
+      </w:r>
+    </w:p>
+    <w:p>
+      <w:pPr>
+        <w:spacing w:line="480" w:lineRule="auto"/>
+        <w:rPr>
+          <w:rFonts w:ascii="Times New Roman" w:hAnsi="Times New Roman" w:cs="Times New Roman"/>
+        </w:rPr>
+      </w:pPr>
+      <w:r>
+        <w:rPr>
+          <w:rFonts w:ascii="Times New Roman" w:hAnsi="Times New Roman" w:cs="Times New Roman"/>
+        </w:rPr>
+        <w:t xml:space="preserve">Here we can see how lopsided the sales of games with acclaimed critic scores are compared to the games with lower scores. The sales of the games with an acclaimed score are double the games with just a good score, it shows that there is a strong correlation between critic scores and sales. </w:t>
+      </w:r>
+    </w:p>
+    <w:p>
+      <w:pPr>
+        <w:spacing w:line="480" w:lineRule="auto"/>
+        <w:rPr>
+          <w:rFonts w:ascii="Times New Roman" w:hAnsi="Times New Roman" w:cs="Times New Roman"/>
+        </w:rPr>
+      </w:pPr>
+    </w:p>
+    <w:p>
+      <w:pPr>
+        <w:spacing w:line="480" w:lineRule="auto"/>
+        <w:rPr>
+          <w:rFonts w:ascii="Times New Roman" w:hAnsi="Times New Roman" w:cs="Times New Roman"/>
+        </w:rPr>
+      </w:pPr>
+    </w:p>
+    <w:p>
+      <w:pPr>
+        <w:spacing w:line="480" w:lineRule="auto"/>
+        <w:rPr>
+          <w:rFonts w:ascii="Times New Roman" w:hAnsi="Times New Roman" w:cs="Times New Roman"/>
+        </w:rPr>
+      </w:pPr>
+    </w:p>
+    <w:p>
+      <w:pPr>
+        <w:spacing w:line="480" w:lineRule="auto"/>
+        <w:rPr>
+          <w:rFonts w:ascii="Times New Roman" w:hAnsi="Times New Roman" w:cs="Times New Roman"/>
+        </w:rPr>
+      </w:pPr>
+      <w:r>
+        <w:rPr>
+          <w:rFonts w:ascii="Times New Roman" w:hAnsi="Times New Roman" w:cs="Times New Roman"/>
+        </w:rPr>
+        <w:lastRenderedPageBreak/>
+        <w:t xml:space="preserve">Chart 6, </w:t>
+      </w:r>
+      <w:r>
+        <w:rPr>
+          <w:rFonts w:ascii="Times New Roman" w:hAnsi="Times New Roman" w:cs="Times New Roman"/>
+        </w:rPr>
+        <w:t>What are some “critic-proof” games:</w:t>
+      </w:r>
+    </w:p>
+    <w:p>
+      <w:pPr>
+        <w:spacing w:line="480" w:lineRule="auto"/>
+        <w:rPr>
+          <w:rFonts w:ascii="Times New Roman" w:hAnsi="Times New Roman" w:cs="Times New Roman"/>
+          <w:b/>
+          <w:bCs/>
+        </w:rPr>
+      </w:pPr>
+      <w:r>
+        <w:rPr>
+          <w:rFonts w:ascii="Times New Roman" w:hAnsi="Times New Roman" w:cs="Times New Roman"/>
+          <w:b/>
+          <w:bCs/>
+          <w:noProof/>
+        </w:rPr>
+        <w:drawing>
+          <wp:inline distT="0" distB="0" distL="0" distR="0" wp14:anchorId="4B976A44" wp14:editId="54D3DD12">
+            <wp:extent cx="5696318" cy="3276600"/>
+            <wp:effectExtent l="0" t="0" r="0" b="0"/>
+            <wp:docPr id="315576313" name="Picture 6"/>
+            <wp:cNvGraphicFramePr>
+              <a:graphicFrameLocks xmlns:a="http://schemas.openxmlformats.org/drawingml/2006/main" noChangeAspect="1"/>
+            </wp:cNvGraphicFramePr>
+            <a:graphic xmlns:a="http://schemas.openxmlformats.org/drawingml/2006/main">
+              <a:graphicData uri="http://schemas.openxmlformats.org/drawingml/2006/picture">
+                <pic:pic xmlns:pic="http://schemas.openxmlformats.org/drawingml/2006/picture">
+                  <pic:nvPicPr>
+                    <pic:cNvPr id="315576313" name="Picture 315576313"/>
+                    <pic:cNvPicPr/>
+                  </pic:nvPicPr>
+                  <pic:blipFill>
+                    <a:blip r:embed="rId27" cstate="print">
+                      <a:extLst>
+                        <a:ext uri="{28A0092B-C50C-407E-A947-70E740481C1C}">
+                          <a14:useLocalDpi xmlns:a14="http://schemas.microsoft.com/office/drawing/2010/main" val="0"/>
+                        </a:ext>
+                      </a:extLst>
+                    </a:blip>
+                    <a:stretch>
+                      <a:fillRect/>
+                    </a:stretch>
+                  </pic:blipFill>
+                  <pic:spPr>
+                    <a:xfrm>
+                      <a:off x="0" y="0"/>
+                      <a:ext cx="5698194" cy="3277679"/>
+                    </a:xfrm>
+                    <a:prstGeom prst="rect">
+                      <a:avLst/>
+                    </a:prstGeom>
+                  </pic:spPr>
+                </pic:pic>
+              </a:graphicData>
+            </a:graphic>
+          </wp:inline>
+        </w:drawing>
+      </w:r>
+    </w:p>
+    <w:p>
+      <w:pPr>
+        <w:spacing w:line="480" w:lineRule="auto"/>
+        <w:rPr>
+          <w:rFonts w:ascii="Times New Roman" w:hAnsi="Times New Roman" w:cs="Times New Roman"/>
+        </w:rPr>
+      </w:pPr>
+      <w:r>
+        <w:rPr>
+          <w:rFonts w:ascii="Times New Roman" w:hAnsi="Times New Roman" w:cs="Times New Roman"/>
+        </w:rPr>
+        <w:t xml:space="preserve">This visualization shows some of the games that had poor reviews but still performed well. The games are also color coded by the companies to help differentiate. </w:t>
+      </w:r>
+    </w:p>
+    <w:p>
+      <w:pPr>
+        <w:spacing w:line="480" w:lineRule="auto"/>
+        <w:rPr>
+          <w:rFonts w:ascii="Times New Roman" w:hAnsi="Times New Roman" w:cs="Times New Roman"/>
+          <w:b/>
+          <w:bCs/>
+        </w:rPr>
+      </w:pPr>
+    </w:p>
+    <w:p>
+      <w:pPr>
+        <w:spacing w:line="480" w:lineRule="auto"/>
+        <w:rPr>
+          <w:rFonts w:ascii="Times New Roman" w:hAnsi="Times New Roman" w:cs="Times New Roman"/>
+          <w:b/>
+          <w:bCs/>
+        </w:rPr>
+      </w:pPr>
+    </w:p>
+    <w:p>
+      <w:pPr>
+        <w:spacing w:line="480" w:lineRule="auto"/>
+        <w:rPr>
+          <w:rFonts w:ascii="Times New Roman" w:hAnsi="Times New Roman" w:cs="Times New Roman"/>
+          <w:b/>
+          <w:bCs/>
+        </w:rPr>
+      </w:pPr>
+    </w:p>
+    <w:p>
+      <w:pPr>
+        <w:spacing w:line="480" w:lineRule="auto"/>
+        <w:rPr>
+          <w:rFonts w:ascii="Times New Roman" w:hAnsi="Times New Roman" w:cs="Times New Roman"/>
+        </w:rPr>
+      </w:pPr>
+    </w:p>
+    <w:p>
+      <w:pPr>
+        <w:spacing w:line="480" w:lineRule="auto"/>
+        <w:rPr>
+          <w:rFonts w:ascii="Times New Roman" w:hAnsi="Times New Roman" w:cs="Times New Roman"/>
+        </w:rPr>
+      </w:pPr>
+      <w:r>
+        <w:rPr>
+          <w:rFonts w:ascii="Times New Roman" w:hAnsi="Times New Roman" w:cs="Times New Roman"/>
+        </w:rPr>
+        <w:br w:type="page"/>
+      </w:r>
+    </w:p>
+    <w:p>
+      <w:pPr>
+        <w:spacing w:line="480" w:lineRule="auto"/>
+        <w:jc w:val="center"/>
+        <w:rPr>
+          <w:rFonts w:ascii="Times New Roman" w:hAnsi="Times New Roman" w:cs="Times New Roman"/>
+          <w:b/>
+          <w:bCs/>
+        </w:rPr>
+      </w:pPr>
+      <w:r>
+        <w:rPr>
+          <w:rFonts w:ascii="Times New Roman" w:hAnsi="Times New Roman" w:cs="Times New Roman"/>
+          <w:b/>
+          <w:bCs/>
+        </w:rPr>
+        <w:lastRenderedPageBreak/>
+        <w:t>Conclusion:</w:t>
+      </w:r>
+    </w:p>
+    <w:p>
+      <w:pPr>
+        <w:spacing w:line="480" w:lineRule="auto"/>
+        <w:rPr>
+          <w:rFonts w:ascii="Times New Roman" w:hAnsi="Times New Roman" w:cs="Times New Roman"/>
+        </w:rPr>
+      </w:pPr>
+      <w:r>
+        <w:rPr>
+          <w:rFonts w:ascii="Times New Roman" w:hAnsi="Times New Roman" w:cs="Times New Roman"/>
+        </w:rPr>
+        <w:t xml:space="preserve">This project set out to answer the question of what platform, genre, publisher, and regional trends have driven video game sales from 1980 to 2024, and whether critical acclaim correlates with commercial success. Through the design of a star schema data warehouse, an ETL pipeline, and a series of analytical queries and visualizations, </w:t>
+      </w:r>
+      <w:r>
+        <w:rPr>
+          <w:rFonts w:ascii="Times New Roman" w:hAnsi="Times New Roman" w:cs="Times New Roman"/>
+        </w:rPr>
+        <w:t xml:space="preserve">we can see </w:t>
+      </w:r>
+      <w:r>
+        <w:rPr>
+          <w:rFonts w:ascii="Times New Roman" w:hAnsi="Times New Roman" w:cs="Times New Roman"/>
+        </w:rPr>
+        <w:t>several meaningful patterns emerged from the data.</w:t>
+      </w:r>
+    </w:p>
+    <w:p>
+      <w:pPr>
+        <w:spacing w:line="480" w:lineRule="auto"/>
+        <w:rPr>
+          <w:rFonts w:ascii="Times New Roman" w:hAnsi="Times New Roman" w:cs="Times New Roman"/>
+        </w:rPr>
+      </w:pPr>
+      <w:r>
+        <w:rPr>
+          <w:rFonts w:ascii="Times New Roman" w:hAnsi="Times New Roman" w:cs="Times New Roman"/>
+        </w:rPr>
+        <w:t>Genre preferences have shifted significantly across console generations, moving from Platform and Puzzle games in the early era to the dominance of Action and Shooter titles in the modern era, reflecting both the evolution of game design and changing player demographics. In the platform wars, Sony leads in total sales volume, but Microsoft's higher average sales per title suggests a different publishing strategy focused on fewer, higher profile releases. Finally, the data confirms that critical acclaim does correlate with commercial success</w:t>
+      </w:r>
+      <w:r>
+        <w:rPr>
+          <w:rFonts w:ascii="Times New Roman" w:hAnsi="Times New Roman" w:cs="Times New Roman"/>
+        </w:rPr>
+        <w:t xml:space="preserve">, </w:t>
+      </w:r>
+      <w:r>
+        <w:rPr>
+          <w:rFonts w:ascii="Times New Roman" w:hAnsi="Times New Roman" w:cs="Times New Roman"/>
+        </w:rPr>
+        <w:t>acclaimed titles average significantly higher sales than mixed or poor reviewed games</w:t>
+      </w:r>
+      <w:r>
+        <w:rPr>
+          <w:rFonts w:ascii="Times New Roman" w:hAnsi="Times New Roman" w:cs="Times New Roman"/>
+        </w:rPr>
+        <w:t xml:space="preserve">, </w:t>
+      </w:r>
+      <w:r>
+        <w:rPr>
+          <w:rFonts w:ascii="Times New Roman" w:hAnsi="Times New Roman" w:cs="Times New Roman"/>
+        </w:rPr>
+        <w:t>however the critic-proof games analysis shows that brand loyalty and franchise recognition can override critical reception entirely.</w:t>
+      </w:r>
+    </w:p>
+    <w:p>
+      <w:pPr>
+        <w:spacing w:line="480" w:lineRule="auto"/>
+        <w:rPr>
+          <w:rFonts w:ascii="Times New Roman" w:hAnsi="Times New Roman" w:cs="Times New Roman"/>
+        </w:rPr>
+      </w:pPr>
+      <w:r>
+        <w:rPr>
+          <w:rFonts w:ascii="Times New Roman" w:hAnsi="Times New Roman" w:cs="Times New Roman"/>
+        </w:rPr>
+        <w:t>From a data warehousing perspective, this project demonstrated the value of dimensional modeling in organizing complex, multi-dimensional data into a structure that supports efficient and meaningful analysis. The t</w:t>
+      </w:r>
+      <w:r>
+        <w:rPr>
+          <w:rFonts w:ascii="Times New Roman" w:hAnsi="Times New Roman" w:cs="Times New Roman"/>
+        </w:rPr>
+        <w:t>wo</w:t>
+      </w:r>
+      <w:r>
+        <w:rPr>
+          <w:rFonts w:ascii="Times New Roman" w:hAnsi="Times New Roman" w:cs="Times New Roman"/>
+        </w:rPr>
+        <w:t xml:space="preserve"> schema architecture, SCD Type 2 implementation, and careful null handling decisions all contributed to a robust analytical foundation that could realistically support business decision making in a game publishing or retail context.</w:t>
+      </w:r>
+    </w:p>
+    <w:p>
+      <w:pPr>
+        <w:rPr>
+          <w:rFonts w:ascii="Times New Roman" w:hAnsi="Times New Roman" w:cs="Times New Roman"/>
+        </w:rPr>
+      </w:pPr>
+      <w:r>
+        <w:rPr>
+          <w:rFonts w:ascii="Times New Roman" w:hAnsi="Times New Roman" w:cs="Times New Roman"/>
+        </w:rPr>
+        <w:br w:type="page"/>
+      </w:r>
+    </w:p>
+    <w:p>
+      <w:pPr>
+        <w:spacing w:line="480" w:lineRule="auto"/>
+        <w:rPr>
+          <w:rFonts w:ascii="Times New Roman" w:hAnsi="Times New Roman" w:cs="Times New Roman"/>
+        </w:rPr>
+      </w:pPr>
+    </w:p>
+    <w:p>
+      <w:pPr>
+        <w:spacing w:line="480" w:lineRule="auto"/>
+        <w:jc w:val="center"/>
+        <w:rPr>
+          <w:rFonts w:ascii="Times New Roman" w:hAnsi="Times New Roman" w:cs="Times New Roman"/>
+          <w:b/>
+          <w:bCs/>
+        </w:rPr>
+      </w:pPr>
+      <w:r>
+        <w:rPr>
+          <w:rFonts w:ascii="Times New Roman" w:hAnsi="Times New Roman" w:cs="Times New Roman"/>
+          <w:b/>
+          <w:bCs/>
+        </w:rPr>
+        <w:t>References:</w:t>
+      </w:r>
+    </w:p>
+    <w:p>
+      <w:pPr>
+        <w:spacing w:line="480" w:lineRule="auto"/>
+        <w:rPr>
+          <w:rFonts w:ascii="Times New Roman" w:hAnsi="Times New Roman" w:cs="Times New Roman"/>
+          <w:b/>
+          <w:bCs/>
+        </w:rPr>
+      </w:pPr>
+      <w:r>
+        <w:rPr>
+          <w:rFonts w:ascii="Times New Roman" w:hAnsi="Times New Roman" w:cs="Times New Roman"/>
+          <w:b/>
+          <w:bCs/>
+        </w:rPr>
+        <w:t xml:space="preserve">Divekar, B. (2024). </w:t>
+      </w:r>
+      <w:r>
+        <w:rPr>
+          <w:rFonts w:ascii="Times New Roman" w:hAnsi="Times New Roman" w:cs="Times New Roman"/>
+          <w:b/>
+          <w:bCs/>
+          <w:i/>
+          <w:iCs/>
+        </w:rPr>
+        <w:t>Video game sales and industry data 1980–2024</w:t>
+      </w:r>
+      <w:r>
+        <w:rPr>
+          <w:rFonts w:ascii="Times New Roman" w:hAnsi="Times New Roman" w:cs="Times New Roman"/>
+          <w:b/>
+          <w:bCs/>
+        </w:rPr>
+        <w:t xml:space="preserve"> [Data set]. Kaggle. </w:t>
+      </w:r>
+      <w:hyperlink r:id="rId28" w:history="1">
+        <w:r>
+          <w:rPr>
+            <w:rStyle w:val="Hyperlink"/>
+            <w:rFonts w:ascii="Times New Roman" w:hAnsi="Times New Roman" w:cs="Times New Roman"/>
+            <w:b/>
+            <w:bCs/>
+          </w:rPr>
+          <w:t>https://www.kaggle.com/datasets/bhushandivekar/video-game-sales-and-industry-data-1980-2024/data</w:t>
+        </w:r>
+      </w:hyperlink>
+    </w:p>
+    <w:p>
+      <w:pPr>
+        <w:spacing w:line="480" w:lineRule="auto"/>
+        <w:rPr>
+          <w:rFonts w:ascii="Times New Roman" w:hAnsi="Times New Roman" w:cs="Times New Roman"/>
+          <w:b/>
+          <w:bCs/>
+        </w:rPr>
+      </w:pPr>
+      <w:r>
+        <w:rPr>
+          <w:rFonts w:ascii="Times New Roman" w:hAnsi="Times New Roman" w:cs="Times New Roman"/>
+          <w:b/>
+          <w:bCs/>
+        </w:rPr>
+        <w:t xml:space="preserve">Harvard Business School Online. (2021). </w:t>
+      </w:r>
+      <w:r>
+        <w:rPr>
+          <w:rFonts w:ascii="Times New Roman" w:hAnsi="Times New Roman" w:cs="Times New Roman"/>
+          <w:b/>
+          <w:bCs/>
+          <w:i/>
+          <w:iCs/>
+        </w:rPr>
+        <w:t>Data storytelling: How to effectively tell a story with data</w:t>
+      </w:r>
+      <w:r>
+        <w:rPr>
+          <w:rFonts w:ascii="Times New Roman" w:hAnsi="Times New Roman" w:cs="Times New Roman"/>
+          <w:b/>
+          <w:bCs/>
+        </w:rPr>
+        <w:t xml:space="preserve">. </w:t>
+      </w:r>
+      <w:hyperlink r:id="rId29" w:history="1">
+        <w:r>
+          <w:rPr>
+            <w:rStyle w:val="Hyperlink"/>
+            <w:rFonts w:ascii="Times New Roman" w:hAnsi="Times New Roman" w:cs="Times New Roman"/>
+            <w:b/>
+            <w:bCs/>
+          </w:rPr>
+          <w:t>https://online.hbs.edu/blog/post/data-storytelling</w:t>
+        </w:r>
+      </w:hyperlink>
+    </w:p>
+    <w:p>
+      <w:pPr>
+        <w:spacing w:line="480" w:lineRule="auto"/>
+        <w:rPr>
+          <w:rFonts w:ascii="Times New Roman" w:hAnsi="Times New Roman" w:cs="Times New Roman"/>
+          <w:b/>
+          <w:bCs/>
+        </w:rPr>
+      </w:pPr>
+      <w:r>
+        <w:rPr>
+          <w:rFonts w:ascii="Times New Roman" w:hAnsi="Times New Roman" w:cs="Times New Roman"/>
+          <w:b/>
+          <w:bCs/>
+        </w:rPr>
+        <w:t xml:space="preserve">IBM. (2025). </w:t>
+      </w:r>
+      <w:r>
+        <w:rPr>
+          <w:rFonts w:ascii="Times New Roman" w:hAnsi="Times New Roman" w:cs="Times New Roman"/>
+          <w:b/>
+          <w:bCs/>
+          <w:i/>
+          <w:iCs/>
+        </w:rPr>
+        <w:t>6 pillars of data quality and how to improve your data</w:t>
+      </w:r>
+      <w:r>
+        <w:rPr>
+          <w:rFonts w:ascii="Times New Roman" w:hAnsi="Times New Roman" w:cs="Times New Roman"/>
+          <w:b/>
+          <w:bCs/>
+        </w:rPr>
+        <w:t xml:space="preserve">. </w:t>
+      </w:r>
+      <w:hyperlink r:id="rId30" w:history="1">
+        <w:r>
+          <w:rPr>
+            <w:rStyle w:val="Hyperlink"/>
+            <w:rFonts w:ascii="Times New Roman" w:hAnsi="Times New Roman" w:cs="Times New Roman"/>
+            <w:b/>
+            <w:bCs/>
+          </w:rPr>
+          <w:t>https://www.ibm.com/products/tutorials/6-pillars-of-data-quality-and-how-to-improve-your-data</w:t>
+        </w:r>
+      </w:hyperlink>
+    </w:p>
+    <w:p>
+      <w:pPr>
+        <w:spacing w:line="480" w:lineRule="auto"/>
+        <w:rPr>
+          <w:rFonts w:ascii="Times New Roman" w:hAnsi="Times New Roman" w:cs="Times New Roman"/>
+          <w:b/>
+          <w:bCs/>
+        </w:rPr>
+      </w:pPr>
+      <w:r>
+        <w:rPr>
+          <w:rFonts w:ascii="Times New Roman" w:hAnsi="Times New Roman" w:cs="Times New Roman"/>
+          <w:b/>
+          <w:bCs/>
+        </w:rPr>
+        <w:t xml:space="preserve">Rashid, H. (2026). </w:t>
+      </w:r>
+      <w:r>
+        <w:rPr>
+          <w:rFonts w:ascii="Times New Roman" w:hAnsi="Times New Roman" w:cs="Times New Roman"/>
+          <w:b/>
+          <w:bCs/>
+          <w:i/>
+          <w:iCs/>
+        </w:rPr>
+        <w:t>Video game sales data warehouse</w:t>
+      </w:r>
+      <w:r>
+        <w:rPr>
+          <w:rFonts w:ascii="Times New Roman" w:hAnsi="Times New Roman" w:cs="Times New Roman"/>
+          <w:b/>
+          <w:bCs/>
+        </w:rPr>
+        <w:t xml:space="preserve"> [Source code]. GitHub. </w:t>
+      </w:r>
+      <w:hyperlink r:id="rId31" w:history="1">
+        <w:r>
+          <w:rPr>
+            <w:rStyle w:val="Hyperlink"/>
+            <w:rFonts w:ascii="Times New Roman" w:hAnsi="Times New Roman" w:cs="Times New Roman"/>
+            <w:b/>
+            <w:bCs/>
+          </w:rPr>
+          <w:t>https://github.com/hrashid13/Retro-Game-DW</w:t>
+        </w:r>
+      </w:hyperlink>
+      <w:r>
+        <w:rPr>
+          <w:rFonts w:ascii="Times New Roman" w:hAnsi="Times New Roman" w:cs="Times New Roman"/>
+          <w:b/>
+          <w:bCs/>
+        </w:rPr>
+        <w:t xml:space="preserve"> </w:t>
+      </w:r>
+    </w:p>
+    <w:p>
+      <w:pPr>
+        <w:spacing w:line="480" w:lineRule="auto"/>
+        <w:rPr>
+          <w:rFonts w:ascii="Times New Roman" w:hAnsi="Times New Roman" w:cs="Times New Roman"/>
+          <w:b/>
+          <w:bCs/>
+        </w:rPr>
+      </w:pPr>
+      <w:r>
+        <w:rPr>
+          <w:rFonts w:ascii="Times New Roman" w:hAnsi="Times New Roman" w:cs="Times New Roman"/>
+          <w:b/>
+          <w:bCs/>
+        </w:rPr>
+        <w:t xml:space="preserve">Snowflake. (2026). </w:t>
+      </w:r>
+      <w:r>
+        <w:rPr>
+          <w:rFonts w:ascii="Times New Roman" w:hAnsi="Times New Roman" w:cs="Times New Roman"/>
+          <w:b/>
+          <w:bCs/>
+          <w:i/>
+          <w:iCs/>
+        </w:rPr>
+        <w:t>What is a star schema? A complete guide for data modeling</w:t>
+      </w:r>
+      <w:r>
+        <w:rPr>
+          <w:rFonts w:ascii="Times New Roman" w:hAnsi="Times New Roman" w:cs="Times New Roman"/>
+          <w:b/>
+          <w:bCs/>
+        </w:rPr>
+        <w:t xml:space="preserve">. </w:t>
+      </w:r>
+      <w:hyperlink r:id="rId32" w:history="1">
+        <w:r>
+          <w:rPr>
+            <w:rStyle w:val="Hyperlink"/>
+            <w:rFonts w:ascii="Times New Roman" w:hAnsi="Times New Roman" w:cs="Times New Roman"/>
+            <w:b/>
+            <w:bCs/>
+          </w:rPr>
+          <w:t>https://www.snowflake.com/en/fundamentals/star-schema/</w:t>
+        </w:r>
+      </w:hyperlink>
+    </w:p>
+    <w:p>
+      <w:pPr>
+        <w:spacing w:line="480" w:lineRule="auto"/>
+        <w:rPr>
+          <w:rFonts w:ascii="Times New Roman" w:hAnsi="Times New Roman" w:cs="Times New Roman"/>
+          <w:b/>
+          <w:bCs/>
+        </w:rPr>
+      </w:pPr>
+      <w:r>
+        <w:rPr>
+          <w:rFonts w:ascii="Times New Roman" w:hAnsi="Times New Roman" w:cs="Times New Roman"/>
+          <w:b/>
+          <w:bCs/>
+        </w:rPr>
+        <w:t xml:space="preserve">Visual Capitalist. (2025). </w:t>
+      </w:r>
+      <w:r>
+        <w:rPr>
+          <w:rFonts w:ascii="Times New Roman" w:hAnsi="Times New Roman" w:cs="Times New Roman"/>
+          <w:b/>
+          <w:bCs/>
+          <w:i/>
+          <w:iCs/>
+        </w:rPr>
+        <w:t>Charted: Video game industry revenue in the U.S. (2002–2024)</w:t>
+      </w:r>
+      <w:r>
+        <w:rPr>
+          <w:rFonts w:ascii="Times New Roman" w:hAnsi="Times New Roman" w:cs="Times New Roman"/>
+          <w:b/>
+          <w:bCs/>
+        </w:rPr>
+        <w:t xml:space="preserve">. </w:t>
+      </w:r>
+      <w:hyperlink r:id="rId33" w:history="1">
+        <w:r>
+          <w:rPr>
+            <w:rStyle w:val="Hyperlink"/>
+            <w:rFonts w:ascii="Times New Roman" w:hAnsi="Times New Roman" w:cs="Times New Roman"/>
+            <w:b/>
+            <w:bCs/>
+          </w:rPr>
+          <w:t>https://www.visualcapitalist.com/video-game-industry-revenue-over-time/</w:t>
+        </w:r>
+      </w:hyperlink>
+    </w:p>
+    <w:p>
+      <w:pPr>
+        <w:spacing w:line="480" w:lineRule="auto"/>
+        <w:rPr>
+          <w:rFonts w:ascii="Times New Roman" w:hAnsi="Times New Roman" w:cs="Times New Roman"/>
+          <w:b/>
+          <w:bCs/>
+        </w:rPr>
+      </w:pPr>
     </w:p>
     <w:p>
       <w:pPr>
@@ -1371,9 +4550,158 @@
     </w:lvl>
   </w:abstractNum>
   <w:abstractNum w:abstractNumId="1" w15:restartNumberingAfterBreak="0">
-    <w:nsid w:val="69162D17"/>
+    <w:nsid w:val="2DCE6697"/>
+    <w:multiLevelType w:val="multilevel"/>
+    <w:tmpl w:val="EA684088"/>
+    <w:lvl w:ilvl="0">
+      <w:start w:val="1"/>
+      <w:numFmt w:val="bullet"/>
+      <w:lvlText w:val=""/>
+      <w:lvlJc w:val="left"/>
+      <w:pPr>
+        <w:tabs>
+          <w:tab w:val="num" w:pos="720"/>
+        </w:tabs>
+        <w:ind w:left="720" w:hanging="360"/>
+      </w:pPr>
+      <w:rPr>
+        <w:rFonts w:ascii="Symbol" w:hAnsi="Symbol" w:hint="default"/>
+        <w:sz w:val="20"/>
+      </w:rPr>
+    </w:lvl>
+    <w:lvl w:ilvl="1" w:tentative="1">
+      <w:start w:val="1"/>
+      <w:numFmt w:val="bullet"/>
+      <w:lvlText w:val="o"/>
+      <w:lvlJc w:val="left"/>
+      <w:pPr>
+        <w:tabs>
+          <w:tab w:val="num" w:pos="1440"/>
+        </w:tabs>
+        <w:ind w:left="1440" w:hanging="360"/>
+      </w:pPr>
+      <w:rPr>
+        <w:rFonts w:ascii="Courier New" w:hAnsi="Courier New" w:hint="default"/>
+        <w:sz w:val="20"/>
+      </w:rPr>
+    </w:lvl>
+    <w:lvl w:ilvl="2" w:tentative="1">
+      <w:start w:val="1"/>
+      <w:numFmt w:val="bullet"/>
+      <w:lvlText w:val=""/>
+      <w:lvlJc w:val="left"/>
+      <w:pPr>
+        <w:tabs>
+          <w:tab w:val="num" w:pos="2160"/>
+        </w:tabs>
+        <w:ind w:left="2160" w:hanging="360"/>
+      </w:pPr>
+      <w:rPr>
+        <w:rFonts w:ascii="Wingdings" w:hAnsi="Wingdings" w:hint="default"/>
+        <w:sz w:val="20"/>
+      </w:rPr>
+    </w:lvl>
+    <w:lvl w:ilvl="3" w:tentative="1">
+      <w:start w:val="1"/>
+      <w:numFmt w:val="bullet"/>
+      <w:lvlText w:val=""/>
+      <w:lvlJc w:val="left"/>
+      <w:pPr>
+        <w:tabs>
+          <w:tab w:val="num" w:pos="2880"/>
+        </w:tabs>
+        <w:ind w:left="2880" w:hanging="360"/>
+      </w:pPr>
+      <w:rPr>
+        <w:rFonts w:ascii="Wingdings" w:hAnsi="Wingdings" w:hint="default"/>
+        <w:sz w:val="20"/>
+      </w:rPr>
+    </w:lvl>
+    <w:lvl w:ilvl="4" w:tentative="1">
+      <w:start w:val="1"/>
+      <w:numFmt w:val="bullet"/>
+      <w:lvlText w:val=""/>
+      <w:lvlJc w:val="left"/>
+      <w:pPr>
+        <w:tabs>
+          <w:tab w:val="num" w:pos="3600"/>
+        </w:tabs>
+        <w:ind w:left="3600" w:hanging="360"/>
+      </w:pPr>
+      <w:rPr>
+        <w:rFonts w:ascii="Wingdings" w:hAnsi="Wingdings" w:hint="default"/>
+        <w:sz w:val="20"/>
+      </w:rPr>
+    </w:lvl>
+    <w:lvl w:ilvl="5" w:tentative="1">
+      <w:start w:val="1"/>
+      <w:numFmt w:val="bullet"/>
+      <w:lvlText w:val=""/>
+      <w:lvlJc w:val="left"/>
+      <w:pPr>
+        <w:tabs>
+          <w:tab w:val="num" w:pos="4320"/>
+        </w:tabs>
+        <w:ind w:left="4320" w:hanging="360"/>
+      </w:pPr>
+      <w:rPr>
+        <w:rFonts w:ascii="Wingdings" w:hAnsi="Wingdings" w:hint="default"/>
+        <w:sz w:val="20"/>
+      </w:rPr>
+    </w:lvl>
+    <w:lvl w:ilvl="6" w:tentative="1">
+      <w:start w:val="1"/>
+      <w:numFmt w:val="bullet"/>
+      <w:lvlText w:val=""/>
+      <w:lvlJc w:val="left"/>
+      <w:pPr>
+        <w:tabs>
+          <w:tab w:val="num" w:pos="5040"/>
+        </w:tabs>
+        <w:ind w:left="5040" w:hanging="360"/>
+      </w:pPr>
+      <w:rPr>
+        <w:rFonts w:ascii="Wingdings" w:hAnsi="Wingdings" w:hint="default"/>
+        <w:sz w:val="20"/>
+      </w:rPr>
+    </w:lvl>
+    <w:lvl w:ilvl="7" w:tentative="1">
+      <w:start w:val="1"/>
+      <w:numFmt w:val="bullet"/>
+      <w:lvlText w:val=""/>
+      <w:lvlJc w:val="left"/>
+      <w:pPr>
+        <w:tabs>
+          <w:tab w:val="num" w:pos="5760"/>
+        </w:tabs>
+        <w:ind w:left="5760" w:hanging="360"/>
+      </w:pPr>
+      <w:rPr>
+        <w:rFonts w:ascii="Wingdings" w:hAnsi="Wingdings" w:hint="default"/>
+        <w:sz w:val="20"/>
+      </w:rPr>
+    </w:lvl>
+    <w:lvl w:ilvl="8" w:tentative="1">
+      <w:start w:val="1"/>
+      <w:numFmt w:val="bullet"/>
+      <w:lvlText w:val=""/>
+      <w:lvlJc w:val="left"/>
+      <w:pPr>
+        <w:tabs>
+          <w:tab w:val="num" w:pos="6480"/>
+        </w:tabs>
+        <w:ind w:left="6480" w:hanging="360"/>
+      </w:pPr>
+      <w:rPr>
+        <w:rFonts w:ascii="Wingdings" w:hAnsi="Wingdings" w:hint="default"/>
+        <w:sz w:val="20"/>
+      </w:rPr>
+    </w:lvl>
+  </w:abstractNum>
+  <w:abstractNum w:abstractNumId="2" w15:restartNumberingAfterBreak="0">
+    <w:nsid w:val="4B2A3F3F"/>
     <w:multiLevelType w:val="hybridMultilevel"/>
-    <w:tmpl w:val="F3EA0600"/>
+    <w:tmpl w:val="2F5AF946"/>
     <w:lvl w:ilvl="0" w:tplc="04090001">
       <w:start w:val="1"/>
       <w:numFmt w:val="bullet"/>
@@ -1483,11 +4811,282 @@
       </w:rPr>
     </w:lvl>
   </w:abstractNum>
+  <w:abstractNum w:abstractNumId="3" w15:restartNumberingAfterBreak="0">
+    <w:nsid w:val="514758B8"/>
+    <w:multiLevelType w:val="multilevel"/>
+    <w:tmpl w:val="A17454A6"/>
+    <w:lvl w:ilvl="0">
+      <w:start w:val="1"/>
+      <w:numFmt w:val="bullet"/>
+      <w:lvlText w:val=""/>
+      <w:lvlJc w:val="left"/>
+      <w:pPr>
+        <w:tabs>
+          <w:tab w:val="num" w:pos="720"/>
+        </w:tabs>
+        <w:ind w:left="720" w:hanging="360"/>
+      </w:pPr>
+      <w:rPr>
+        <w:rFonts w:ascii="Symbol" w:hAnsi="Symbol" w:hint="default"/>
+        <w:sz w:val="20"/>
+      </w:rPr>
+    </w:lvl>
+    <w:lvl w:ilvl="1" w:tentative="1">
+      <w:start w:val="1"/>
+      <w:numFmt w:val="bullet"/>
+      <w:lvlText w:val="o"/>
+      <w:lvlJc w:val="left"/>
+      <w:pPr>
+        <w:tabs>
+          <w:tab w:val="num" w:pos="1440"/>
+        </w:tabs>
+        <w:ind w:left="1440" w:hanging="360"/>
+      </w:pPr>
+      <w:rPr>
+        <w:rFonts w:ascii="Courier New" w:hAnsi="Courier New" w:hint="default"/>
+        <w:sz w:val="20"/>
+      </w:rPr>
+    </w:lvl>
+    <w:lvl w:ilvl="2" w:tentative="1">
+      <w:start w:val="1"/>
+      <w:numFmt w:val="bullet"/>
+      <w:lvlText w:val=""/>
+      <w:lvlJc w:val="left"/>
+      <w:pPr>
+        <w:tabs>
+          <w:tab w:val="num" w:pos="2160"/>
+        </w:tabs>
+        <w:ind w:left="2160" w:hanging="360"/>
+      </w:pPr>
+      <w:rPr>
+        <w:rFonts w:ascii="Wingdings" w:hAnsi="Wingdings" w:hint="default"/>
+        <w:sz w:val="20"/>
+      </w:rPr>
+    </w:lvl>
+    <w:lvl w:ilvl="3" w:tentative="1">
+      <w:start w:val="1"/>
+      <w:numFmt w:val="bullet"/>
+      <w:lvlText w:val=""/>
+      <w:lvlJc w:val="left"/>
+      <w:pPr>
+        <w:tabs>
+          <w:tab w:val="num" w:pos="2880"/>
+        </w:tabs>
+        <w:ind w:left="2880" w:hanging="360"/>
+      </w:pPr>
+      <w:rPr>
+        <w:rFonts w:ascii="Wingdings" w:hAnsi="Wingdings" w:hint="default"/>
+        <w:sz w:val="20"/>
+      </w:rPr>
+    </w:lvl>
+    <w:lvl w:ilvl="4" w:tentative="1">
+      <w:start w:val="1"/>
+      <w:numFmt w:val="bullet"/>
+      <w:lvlText w:val=""/>
+      <w:lvlJc w:val="left"/>
+      <w:pPr>
+        <w:tabs>
+          <w:tab w:val="num" w:pos="3600"/>
+        </w:tabs>
+        <w:ind w:left="3600" w:hanging="360"/>
+      </w:pPr>
+      <w:rPr>
+        <w:rFonts w:ascii="Wingdings" w:hAnsi="Wingdings" w:hint="default"/>
+        <w:sz w:val="20"/>
+      </w:rPr>
+    </w:lvl>
+    <w:lvl w:ilvl="5" w:tentative="1">
+      <w:start w:val="1"/>
+      <w:numFmt w:val="bullet"/>
+      <w:lvlText w:val=""/>
+      <w:lvlJc w:val="left"/>
+      <w:pPr>
+        <w:tabs>
+          <w:tab w:val="num" w:pos="4320"/>
+        </w:tabs>
+        <w:ind w:left="4320" w:hanging="360"/>
+      </w:pPr>
+      <w:rPr>
+        <w:rFonts w:ascii="Wingdings" w:hAnsi="Wingdings" w:hint="default"/>
+        <w:sz w:val="20"/>
+      </w:rPr>
+    </w:lvl>
+    <w:lvl w:ilvl="6" w:tentative="1">
+      <w:start w:val="1"/>
+      <w:numFmt w:val="bullet"/>
+      <w:lvlText w:val=""/>
+      <w:lvlJc w:val="left"/>
+      <w:pPr>
+        <w:tabs>
+          <w:tab w:val="num" w:pos="5040"/>
+        </w:tabs>
+        <w:ind w:left="5040" w:hanging="360"/>
+      </w:pPr>
+      <w:rPr>
+        <w:rFonts w:ascii="Wingdings" w:hAnsi="Wingdings" w:hint="default"/>
+        <w:sz w:val="20"/>
+      </w:rPr>
+    </w:lvl>
+    <w:lvl w:ilvl="7" w:tentative="1">
+      <w:start w:val="1"/>
+      <w:numFmt w:val="bullet"/>
+      <w:lvlText w:val=""/>
+      <w:lvlJc w:val="left"/>
+      <w:pPr>
+        <w:tabs>
+          <w:tab w:val="num" w:pos="5760"/>
+        </w:tabs>
+        <w:ind w:left="5760" w:hanging="360"/>
+      </w:pPr>
+      <w:rPr>
+        <w:rFonts w:ascii="Wingdings" w:hAnsi="Wingdings" w:hint="default"/>
+        <w:sz w:val="20"/>
+      </w:rPr>
+    </w:lvl>
+    <w:lvl w:ilvl="8" w:tentative="1">
+      <w:start w:val="1"/>
+      <w:numFmt w:val="bullet"/>
+      <w:lvlText w:val=""/>
+      <w:lvlJc w:val="left"/>
+      <w:pPr>
+        <w:tabs>
+          <w:tab w:val="num" w:pos="6480"/>
+        </w:tabs>
+        <w:ind w:left="6480" w:hanging="360"/>
+      </w:pPr>
+      <w:rPr>
+        <w:rFonts w:ascii="Wingdings" w:hAnsi="Wingdings" w:hint="default"/>
+        <w:sz w:val="20"/>
+      </w:rPr>
+    </w:lvl>
+  </w:abstractNum>
+  <w:abstractNum w:abstractNumId="4" w15:restartNumberingAfterBreak="0">
+    <w:nsid w:val="69162D17"/>
+    <w:multiLevelType w:val="hybridMultilevel"/>
+    <w:tmpl w:val="F3EA0600"/>
+    <w:lvl w:ilvl="0" w:tplc="04090001">
+      <w:start w:val="1"/>
+      <w:numFmt w:val="bullet"/>
+      <w:lvlText w:val=""/>
+      <w:lvlJc w:val="left"/>
+      <w:pPr>
+        <w:ind w:left="720" w:hanging="360"/>
+      </w:pPr>
+      <w:rPr>
+        <w:rFonts w:ascii="Symbol" w:hAnsi="Symbol" w:hint="default"/>
+      </w:rPr>
+    </w:lvl>
+    <w:lvl w:ilvl="1" w:tplc="04090003" w:tentative="1">
+      <w:start w:val="1"/>
+      <w:numFmt w:val="bullet"/>
+      <w:lvlText w:val="o"/>
+      <w:lvlJc w:val="left"/>
+      <w:pPr>
+        <w:ind w:left="1440" w:hanging="360"/>
+      </w:pPr>
+      <w:rPr>
+        <w:rFonts w:ascii="Courier New" w:hAnsi="Courier New" w:cs="Courier New" w:hint="default"/>
+      </w:rPr>
+    </w:lvl>
+    <w:lvl w:ilvl="2" w:tplc="04090005" w:tentative="1">
+      <w:start w:val="1"/>
+      <w:numFmt w:val="bullet"/>
+      <w:lvlText w:val=""/>
+      <w:lvlJc w:val="left"/>
+      <w:pPr>
+        <w:ind w:left="2160" w:hanging="360"/>
+      </w:pPr>
+      <w:rPr>
+        <w:rFonts w:ascii="Wingdings" w:hAnsi="Wingdings" w:hint="default"/>
+      </w:rPr>
+    </w:lvl>
+    <w:lvl w:ilvl="3" w:tplc="04090001" w:tentative="1">
+      <w:start w:val="1"/>
+      <w:numFmt w:val="bullet"/>
+      <w:lvlText w:val=""/>
+      <w:lvlJc w:val="left"/>
+      <w:pPr>
+        <w:ind w:left="2880" w:hanging="360"/>
+      </w:pPr>
+      <w:rPr>
+        <w:rFonts w:ascii="Symbol" w:hAnsi="Symbol" w:hint="default"/>
+      </w:rPr>
+    </w:lvl>
+    <w:lvl w:ilvl="4" w:tplc="04090003" w:tentative="1">
+      <w:start w:val="1"/>
+      <w:numFmt w:val="bullet"/>
+      <w:lvlText w:val="o"/>
+      <w:lvlJc w:val="left"/>
+      <w:pPr>
+        <w:ind w:left="3600" w:hanging="360"/>
+      </w:pPr>
+      <w:rPr>
+        <w:rFonts w:ascii="Courier New" w:hAnsi="Courier New" w:cs="Courier New" w:hint="default"/>
+      </w:rPr>
+    </w:lvl>
+    <w:lvl w:ilvl="5" w:tplc="04090005" w:tentative="1">
+      <w:start w:val="1"/>
+      <w:numFmt w:val="bullet"/>
+      <w:lvlText w:val=""/>
+      <w:lvlJc w:val="left"/>
+      <w:pPr>
+        <w:ind w:left="4320" w:hanging="360"/>
+      </w:pPr>
+      <w:rPr>
+        <w:rFonts w:ascii="Wingdings" w:hAnsi="Wingdings" w:hint="default"/>
+      </w:rPr>
+    </w:lvl>
+    <w:lvl w:ilvl="6" w:tplc="04090001" w:tentative="1">
+      <w:start w:val="1"/>
+      <w:numFmt w:val="bullet"/>
+      <w:lvlText w:val=""/>
+      <w:lvlJc w:val="left"/>
+      <w:pPr>
+        <w:ind w:left="5040" w:hanging="360"/>
+      </w:pPr>
+      <w:rPr>
+        <w:rFonts w:ascii="Symbol" w:hAnsi="Symbol" w:hint="default"/>
+      </w:rPr>
+    </w:lvl>
+    <w:lvl w:ilvl="7" w:tplc="04090003" w:tentative="1">
+      <w:start w:val="1"/>
+      <w:numFmt w:val="bullet"/>
+      <w:lvlText w:val="o"/>
+      <w:lvlJc w:val="left"/>
+      <w:pPr>
+        <w:ind w:left="5760" w:hanging="360"/>
+      </w:pPr>
+      <w:rPr>
+        <w:rFonts w:ascii="Courier New" w:hAnsi="Courier New" w:cs="Courier New" w:hint="default"/>
+      </w:rPr>
+    </w:lvl>
+    <w:lvl w:ilvl="8" w:tplc="04090005" w:tentative="1">
+      <w:start w:val="1"/>
+      <w:numFmt w:val="bullet"/>
+      <w:lvlText w:val=""/>
+      <w:lvlJc w:val="left"/>
+      <w:pPr>
+        <w:ind w:left="6480" w:hanging="360"/>
+      </w:pPr>
+      <w:rPr>
+        <w:rFonts w:ascii="Wingdings" w:hAnsi="Wingdings" w:hint="default"/>
+      </w:rPr>
+    </w:lvl>
+  </w:abstractNum>
   <w:num w:numId="1" w16cid:durableId="281616069">
     <w:abstractNumId w:val="0"/>
   </w:num>
   <w:num w:numId="2" w16cid:durableId="952326879">
+    <w:abstractNumId w:val="4"/>
+  </w:num>
+  <w:num w:numId="3" w16cid:durableId="2114546826">
     <w:abstractNumId w:val="1"/>
+  </w:num>
+  <w:num w:numId="4" w16cid:durableId="138110243">
+    <w:abstractNumId w:val="2"/>
+  </w:num>
+  <w:num w:numId="5" w16cid:durableId="2033876401">
+    <w:abstractNumId w:val="3"/>
   </w:num>
 </w:numbering>
 </file>
@@ -1892,7 +5491,7 @@
   <w:style w:type="paragraph" w:default="1" w:styleId="Normal">
     <w:name w:val="Normal"/>
     <w:qFormat/>
-    <w:rsid w:val="00C74A6E"/>
+    <w:rsid w:val="0064105A"/>
   </w:style>
   <w:style w:type="paragraph" w:styleId="Heading1">
     <w:name w:val="heading 1"/>

</xml_diff>